<commit_message>
docs: update 汇总28nm综合结果.docx; gitignore Word lock files (~$*)
</commit_message>
<xml_diff>
--- a/汇总28nm综合结果.docx
+++ b/汇总28nm综合结果.docx
@@ -1,6 +1,6 @@
 
 <file path=word/document.xml><?xml version="1.0" encoding="utf-8"?>
-<w:document xmlns:wpc="http://schemas.microsoft.com/office/word/2010/wordprocessingCanvas" xmlns:cx="http://schemas.microsoft.com/office/drawing/2014/chartex" xmlns:cx1="http://schemas.microsoft.com/office/drawing/2015/9/8/chartex" xmlns:cx2="http://schemas.microsoft.com/office/drawing/2015/10/21/chartex" xmlns:cx3="http://schemas.microsoft.com/office/drawing/2016/5/9/chartex" xmlns:cx4="http://schemas.microsoft.com/office/drawing/2016/5/10/chartex" xmlns:cx5="http://schemas.microsoft.com/office/drawing/2016/5/11/chartex" xmlns:cx6="http://schemas.microsoft.com/office/drawing/2016/5/12/chartex" xmlns:cx7="http://schemas.microsoft.com/office/drawing/2016/5/13/chartex" xmlns:cx8="http://schemas.microsoft.com/office/drawing/2016/5/14/chartex" xmlns:mc="http://schemas.openxmlformats.org/markup-compatibility/2006" xmlns:aink="http://schemas.microsoft.com/office/drawing/2016/ink" xmlns:am3d="http://schemas.microsoft.com/office/drawing/2017/model3d" xmlns:o="urn:schemas-microsoft-com:office:office" xmlns:r="http://schemas.openxmlformats.org/officeDocument/2006/relationships" xmlns:m="http://schemas.openxmlformats.org/officeDocument/2006/math" xmlns:v="urn:schemas-microsoft-com:vml" xmlns:wp14="http://schemas.microsoft.com/office/word/2010/wordprocessingDrawing" xmlns:wp="http://schemas.openxmlformats.org/drawingml/2006/wordprocessingDrawing" xmlns:w10="urn:schemas-microsoft-com:office:word" xmlns:w="http://schemas.openxmlformats.org/wordprocessingml/2006/main" xmlns:w14="http://schemas.microsoft.com/office/word/2010/wordml" xmlns:w15="http://schemas.microsoft.com/office/word/2012/wordml" xmlns:w16cid="http://schemas.microsoft.com/office/word/2016/wordml/cid" xmlns:w16se="http://schemas.microsoft.com/office/word/2015/wordml/symex" xmlns:wpg="http://schemas.microsoft.com/office/word/2010/wordprocessingGroup" xmlns:wpi="http://schemas.microsoft.com/office/word/2010/wordprocessingInk" xmlns:wne="http://schemas.microsoft.com/office/word/2006/wordml" xmlns:wps="http://schemas.microsoft.com/office/word/2010/wordprocessingShape" mc:Ignorable="w14 w15 w16se w16cid wp14">
+<w:document xmlns:wpc="http://schemas.microsoft.com/office/word/2010/wordprocessingCanvas" xmlns:cx="http://schemas.microsoft.com/office/drawing/2014/chartex" xmlns:cx1="http://schemas.microsoft.com/office/drawing/2015/9/8/chartex" xmlns:cx2="http://schemas.microsoft.com/office/drawing/2015/10/21/chartex" xmlns:cx3="http://schemas.microsoft.com/office/drawing/2016/5/9/chartex" xmlns:cx4="http://schemas.microsoft.com/office/drawing/2016/5/10/chartex" xmlns:cx5="http://schemas.microsoft.com/office/drawing/2016/5/11/chartex" xmlns:cx6="http://schemas.microsoft.com/office/drawing/2016/5/12/chartex" xmlns:cx7="http://schemas.microsoft.com/office/drawing/2016/5/13/chartex" xmlns:cx8="http://schemas.microsoft.com/office/drawing/2016/5/14/chartex" xmlns:mc="http://schemas.openxmlformats.org/markup-compatibility/2006" xmlns:m="http://schemas.openxmlformats.org/officeDocument/2006/math" xmlns:aink="http://schemas.microsoft.com/office/drawing/2016/ink" xmlns:am3d="http://schemas.microsoft.com/office/drawing/2017/model3d" xmlns:oel="http://schemas.microsoft.com/office/2019/extlst" xmlns:r="http://schemas.openxmlformats.org/officeDocument/2006/relationships" xmlns:wp14="http://schemas.microsoft.com/office/word/2010/wordprocessingDrawing" xmlns:wp="http://schemas.openxmlformats.org/drawingml/2006/wordprocessingDrawing" xmlns:wpg="http://schemas.microsoft.com/office/word/2010/wordprocessingGroup" xmlns:wpi="http://schemas.microsoft.com/office/word/2010/wordprocessingInk" xmlns:wps="http://schemas.microsoft.com/office/word/2010/wordprocessingShape" xmlns:o="urn:schemas-microsoft-com:office:office" xmlns:v="urn:schemas-microsoft-com:vml" xmlns:w10="urn:schemas-microsoft-com:office:word" xmlns:w="http://schemas.openxmlformats.org/wordprocessingml/2006/main" xmlns:w14="http://schemas.microsoft.com/office/word/2010/wordml" xmlns:w15="http://schemas.microsoft.com/office/word/2012/wordml" xmlns:w16cex="http://schemas.microsoft.com/office/word/2018/wordml/cex" xmlns:w16cid="http://schemas.microsoft.com/office/word/2016/wordml/cid" xmlns:w16="http://schemas.microsoft.com/office/word/2018/wordml" xmlns:w16sdtdh="http://schemas.microsoft.com/office/word/2020/wordml/sdtdatahash" xmlns:w16sdtfl="http://schemas.microsoft.com/office/word/2024/wordml/sdtformatlock" xmlns:w16se="http://schemas.microsoft.com/office/word/2015/wordml/symex" xmlns:w16du="http://schemas.microsoft.com/office/word/2023/wordml/word16du" xmlns:wne="http://schemas.microsoft.com/office/word/2006/wordml" mc:Ignorable="w14 w15 w16se w16cid w16 w16cex w16sdtdh w16sdtfl w16du wp14">
   <w:body>
     <w:p>
       <w:pPr>
@@ -2661,9 +2661,9 @@
         <w:tblLook w:val="04A0" w:firstRow="1" w:lastRow="0" w:firstColumn="1" w:lastColumn="0" w:noHBand="0" w:noVBand="1"/>
       </w:tblPr>
       <w:tblGrid>
-        <w:gridCol w:w="1465"/>
-        <w:gridCol w:w="1209"/>
-        <w:gridCol w:w="5632"/>
+        <w:gridCol w:w="1477"/>
+        <w:gridCol w:w="1217"/>
+        <w:gridCol w:w="5612"/>
       </w:tblGrid>
       <w:tr>
         <w:trPr>
@@ -3261,10 +3261,10 @@
       </w:tblPr>
       <w:tblGrid>
         <w:gridCol w:w="793"/>
-        <w:gridCol w:w="1108"/>
-        <w:gridCol w:w="1668"/>
-        <w:gridCol w:w="3073"/>
-        <w:gridCol w:w="1654"/>
+        <w:gridCol w:w="1100"/>
+        <w:gridCol w:w="1673"/>
+        <w:gridCol w:w="3080"/>
+        <w:gridCol w:w="1650"/>
       </w:tblGrid>
       <w:tr>
         <w:tc>
@@ -3616,7 +3616,15 @@
           </w:tcPr>
           <w:p>
             <w:r>
-              <w:t>(3+3)%4=2</w:t>
+              <w:t>(3+</w:t>
+            </w:r>
+            <w:proofErr w:type="gramStart"/>
+            <w:r>
+              <w:t>3)%</w:t>
+            </w:r>
+            <w:proofErr w:type="gramEnd"/>
+            <w:r>
+              <w:t>4=2</w:t>
             </w:r>
           </w:p>
         </w:tc>
@@ -4057,8 +4065,8 @@
       <w:tblGrid>
         <w:gridCol w:w="1169"/>
         <w:gridCol w:w="2508"/>
-        <w:gridCol w:w="1827"/>
-        <w:gridCol w:w="2802"/>
+        <w:gridCol w:w="1803"/>
+        <w:gridCol w:w="2826"/>
       </w:tblGrid>
       <w:tr>
         <w:trPr>
@@ -4244,7 +4252,15 @@
           </w:tcPr>
           <w:p>
             <w:r>
-              <w:t>(0−3)%4 = 1</w:t>
+              <w:t>(0−</w:t>
+            </w:r>
+            <w:proofErr w:type="gramStart"/>
+            <w:r>
+              <w:t>3)%</w:t>
+            </w:r>
+            <w:proofErr w:type="gramEnd"/>
+            <w:r>
+              <w:t>4 = 1</w:t>
             </w:r>
           </w:p>
         </w:tc>
@@ -4320,7 +4336,15 @@
           </w:tcPr>
           <w:p>
             <w:r>
-              <w:t>(1−3)%4 = 2</w:t>
+              <w:t>(1−</w:t>
+            </w:r>
+            <w:proofErr w:type="gramStart"/>
+            <w:r>
+              <w:t>3)%</w:t>
+            </w:r>
+            <w:proofErr w:type="gramEnd"/>
+            <w:r>
+              <w:t>4 = 2</w:t>
             </w:r>
           </w:p>
         </w:tc>
@@ -4396,7 +4420,15 @@
           </w:tcPr>
           <w:p>
             <w:r>
-              <w:t>(2−3)%4 = 3</w:t>
+              <w:t>(2−</w:t>
+            </w:r>
+            <w:proofErr w:type="gramStart"/>
+            <w:r>
+              <w:t>3)%</w:t>
+            </w:r>
+            <w:proofErr w:type="gramEnd"/>
+            <w:r>
+              <w:t>4 = 3</w:t>
             </w:r>
           </w:p>
         </w:tc>
@@ -4487,7 +4519,15 @@
           </w:tcPr>
           <w:p>
             <w:r>
-              <w:t>(3−3)%4 = 0</w:t>
+              <w:t>(3−</w:t>
+            </w:r>
+            <w:proofErr w:type="gramStart"/>
+            <w:r>
+              <w:t>3)%</w:t>
+            </w:r>
+            <w:proofErr w:type="gramEnd"/>
+            <w:r>
+              <w:t>4 = 0</w:t>
             </w:r>
           </w:p>
         </w:tc>
@@ -5077,9 +5117,9 @@
         <w:tblLook w:val="04A0" w:firstRow="1" w:lastRow="0" w:firstColumn="1" w:lastColumn="0" w:noHBand="0" w:noVBand="1"/>
       </w:tblPr>
       <w:tblGrid>
-        <w:gridCol w:w="1784"/>
-        <w:gridCol w:w="4575"/>
-        <w:gridCol w:w="1947"/>
+        <w:gridCol w:w="1783"/>
+        <w:gridCol w:w="4557"/>
+        <w:gridCol w:w="1966"/>
       </w:tblGrid>
       <w:tr>
         <w:trPr>
@@ -5483,9 +5523,9 @@
       </w:tblPr>
       <w:tblGrid>
         <w:gridCol w:w="1944"/>
-        <w:gridCol w:w="2483"/>
-        <w:gridCol w:w="1803"/>
-        <w:gridCol w:w="2076"/>
+        <w:gridCol w:w="2506"/>
+        <w:gridCol w:w="1792"/>
+        <w:gridCol w:w="2064"/>
       </w:tblGrid>
       <w:tr>
         <w:trPr>
@@ -7413,7 +7453,7 @@
         <w:tblLook w:val="04A0" w:firstRow="1" w:lastRow="0" w:firstColumn="1" w:lastColumn="0" w:noHBand="0" w:noVBand="1"/>
       </w:tblPr>
       <w:tblGrid>
-        <w:gridCol w:w="1421"/>
+        <w:gridCol w:w="1440"/>
         <w:gridCol w:w="5409"/>
       </w:tblGrid>
       <w:tr>
@@ -8057,11 +8097,11 @@
         <w:tblLook w:val="04A0" w:firstRow="1" w:lastRow="0" w:firstColumn="1" w:lastColumn="0" w:noHBand="0" w:noVBand="1"/>
       </w:tblPr>
       <w:tblGrid>
-        <w:gridCol w:w="943"/>
-        <w:gridCol w:w="1349"/>
-        <w:gridCol w:w="2603"/>
-        <w:gridCol w:w="1053"/>
-        <w:gridCol w:w="1053"/>
+        <w:gridCol w:w="944"/>
+        <w:gridCol w:w="1351"/>
+        <w:gridCol w:w="2576"/>
+        <w:gridCol w:w="1065"/>
+        <w:gridCol w:w="1065"/>
         <w:gridCol w:w="1305"/>
       </w:tblGrid>
       <w:tr>
@@ -8720,11 +8760,11 @@
         <w:tblLook w:val="04A0" w:firstRow="1" w:lastRow="0" w:firstColumn="1" w:lastColumn="0" w:noHBand="0" w:noVBand="1"/>
       </w:tblPr>
       <w:tblGrid>
-        <w:gridCol w:w="925"/>
-        <w:gridCol w:w="1345"/>
-        <w:gridCol w:w="2625"/>
-        <w:gridCol w:w="1053"/>
-        <w:gridCol w:w="1053"/>
+        <w:gridCol w:w="927"/>
+        <w:gridCol w:w="1347"/>
+        <w:gridCol w:w="2597"/>
+        <w:gridCol w:w="1065"/>
+        <w:gridCol w:w="1065"/>
         <w:gridCol w:w="1305"/>
       </w:tblGrid>
       <w:tr>
@@ -9392,11 +9432,11 @@
         <w:tblLook w:val="04A0" w:firstRow="1" w:lastRow="0" w:firstColumn="1" w:lastColumn="0" w:noHBand="0" w:noVBand="1"/>
       </w:tblPr>
       <w:tblGrid>
-        <w:gridCol w:w="937"/>
-        <w:gridCol w:w="1348"/>
-        <w:gridCol w:w="2610"/>
-        <w:gridCol w:w="1053"/>
-        <w:gridCol w:w="1053"/>
+        <w:gridCol w:w="938"/>
+        <w:gridCol w:w="1350"/>
+        <w:gridCol w:w="2583"/>
+        <w:gridCol w:w="1065"/>
+        <w:gridCol w:w="1065"/>
         <w:gridCol w:w="1305"/>
       </w:tblGrid>
       <w:tr>
@@ -10413,7 +10453,6 @@
             <w:pPr>
               <w:ind w:firstLine="0"/>
               <w:rPr>
-                <w:rFonts w:hint="eastAsia"/>
                 <w:color w:val="EE0000"/>
               </w:rPr>
             </w:pPr>
@@ -10433,7 +10472,6 @@
             <w:pPr>
               <w:ind w:firstLine="0"/>
               <w:rPr>
-                <w:rFonts w:hint="eastAsia"/>
                 <w:color w:val="EE0000"/>
               </w:rPr>
             </w:pPr>
@@ -10507,7 +10545,6 @@
             <w:pPr>
               <w:ind w:firstLine="0"/>
               <w:rPr>
-                <w:rFonts w:hint="eastAsia"/>
                 <w:color w:val="EE0000"/>
               </w:rPr>
             </w:pPr>
@@ -10534,7 +10571,6 @@
             <w:pPr>
               <w:ind w:firstLine="0"/>
               <w:rPr>
-                <w:rFonts w:hint="eastAsia"/>
                 <w:color w:val="EE0000"/>
               </w:rPr>
             </w:pPr>
@@ -11180,9 +11216,6 @@
           <w:p>
             <w:pPr>
               <w:ind w:firstLine="0"/>
-              <w:rPr>
-                <w:rFonts w:hint="eastAsia"/>
-              </w:rPr>
             </w:pPr>
             <w:r>
               <w:t>exp2_five_lane_pool_top_llama</w:t>
@@ -11196,9 +11229,6 @@
           <w:p>
             <w:pPr>
               <w:ind w:firstLine="0"/>
-              <w:rPr>
-                <w:rFonts w:hint="eastAsia"/>
-              </w:rPr>
             </w:pPr>
             <w:r>
               <w:rPr>
@@ -11254,9 +11284,6 @@
           <w:p>
             <w:pPr>
               <w:ind w:firstLine="0"/>
-              <w:rPr>
-                <w:rFonts w:hint="eastAsia"/>
-              </w:rPr>
             </w:pPr>
             <w:r>
               <w:rPr>
@@ -11276,9 +11303,6 @@
           <w:p>
             <w:pPr>
               <w:ind w:firstLine="0"/>
-              <w:rPr>
-                <w:rFonts w:hint="eastAsia"/>
-              </w:rPr>
             </w:pPr>
             <w:r>
               <w:rPr>
@@ -11298,9 +11322,6 @@
           <w:p>
             <w:pPr>
               <w:ind w:firstLine="0"/>
-              <w:rPr>
-                <w:rFonts w:hint="eastAsia"/>
-              </w:rPr>
             </w:pPr>
             <w:r>
               <w:rPr>
@@ -11449,11 +11470,9 @@
       <w:pPr>
         <w:ind w:firstLine="0"/>
         <w:rPr>
-          <w:rFonts w:hint="eastAsia"/>
-          <w:bCs/>
-        </w:rPr>
-      </w:pPr>
-      <w:bookmarkStart w:id="4" w:name="_GoBack"/>
+          <w:bCs/>
+        </w:rPr>
+      </w:pPr>
       <w:r>
         <w:rPr>
           <w:rFonts w:hint="eastAsia"/>
@@ -11480,7 +11499,6 @@
       <w:pPr>
         <w:ind w:firstLine="0"/>
         <w:rPr>
-          <w:rFonts w:hint="eastAsia"/>
           <w:bCs/>
         </w:rPr>
       </w:pPr>
@@ -11533,7 +11551,6 @@
       <w:pPr>
         <w:ind w:firstLine="0"/>
         <w:rPr>
-          <w:rFonts w:hint="eastAsia"/>
           <w:bCs/>
         </w:rPr>
       </w:pPr>
@@ -11616,7 +11633,6 @@
       <w:pPr>
         <w:ind w:firstLine="0"/>
         <w:rPr>
-          <w:rFonts w:hint="eastAsia"/>
           <w:bCs/>
         </w:rPr>
       </w:pPr>
@@ -11711,7 +11727,6 @@
       <w:pPr>
         <w:ind w:firstLine="0"/>
         <w:rPr>
-          <w:rFonts w:hint="eastAsia"/>
           <w:bCs/>
         </w:rPr>
       </w:pPr>
@@ -11758,7 +11773,6 @@
       <w:pPr>
         <w:ind w:firstLine="0"/>
         <w:rPr>
-          <w:rFonts w:hint="eastAsia"/>
           <w:bCs/>
         </w:rPr>
       </w:pPr>
@@ -11804,7 +11818,6 @@
       <w:pPr>
         <w:ind w:firstLine="0"/>
         <w:rPr>
-          <w:rFonts w:hint="eastAsia"/>
           <w:bCs/>
         </w:rPr>
       </w:pPr>
@@ -11887,7 +11900,6 @@
       <w:pPr>
         <w:ind w:firstLine="0"/>
         <w:rPr>
-          <w:rFonts w:hint="eastAsia"/>
           <w:bCs/>
         </w:rPr>
       </w:pPr>
@@ -11983,7 +11995,6 @@
       <w:pPr>
         <w:ind w:firstLine="0"/>
         <w:rPr>
-          <w:rFonts w:hint="eastAsia"/>
           <w:bCs/>
         </w:rPr>
       </w:pPr>
@@ -12030,7 +12041,6 @@
       <w:pPr>
         <w:ind w:firstLine="0"/>
         <w:rPr>
-          <w:rFonts w:hint="eastAsia"/>
           <w:bCs/>
         </w:rPr>
       </w:pPr>
@@ -12347,7 +12357,6 @@
         <w:t>，而不是功耗脚本或窗口取错。</w:t>
       </w:r>
     </w:p>
-    <w:bookmarkEnd w:id="4"/>
     <w:p>
       <w:pPr>
         <w:ind w:firstLine="0"/>
@@ -12795,9 +12804,6 @@
           <w:p>
             <w:pPr>
               <w:ind w:firstLine="0"/>
-              <w:rPr>
-                <w:rFonts w:hint="eastAsia"/>
-              </w:rPr>
             </w:pPr>
             <w:r>
               <w:t>exp2_five_lane_pool_top_sd_unet</w:t>
@@ -12811,9 +12817,6 @@
           <w:p>
             <w:pPr>
               <w:ind w:firstLine="0"/>
-              <w:rPr>
-                <w:rFonts w:hint="eastAsia"/>
-              </w:rPr>
             </w:pPr>
             <w:r>
               <w:t>config</w:t>
@@ -12872,9 +12875,6 @@
           <w:p>
             <w:pPr>
               <w:ind w:firstLine="0"/>
-              <w:rPr>
-                <w:rFonts w:hint="eastAsia"/>
-              </w:rPr>
             </w:pPr>
             <w:r>
               <w:rPr>
@@ -12894,9 +12894,6 @@
           <w:p>
             <w:pPr>
               <w:ind w:firstLine="0"/>
-              <w:rPr>
-                <w:rFonts w:hint="eastAsia"/>
-              </w:rPr>
             </w:pPr>
             <w:r>
               <w:t>7.726</w:t>
@@ -12910,9 +12907,6 @@
           <w:p>
             <w:pPr>
               <w:ind w:firstLine="0"/>
-              <w:rPr>
-                <w:rFonts w:hint="eastAsia"/>
-              </w:rPr>
             </w:pPr>
             <w:r>
               <w:rPr>
@@ -13111,7 +13105,7 @@
       <w:pPr>
         <w:ind w:firstLine="0"/>
       </w:pPr>
-      <w:bookmarkStart w:id="5" w:name="OLE_LINK6"/>
+      <w:bookmarkStart w:id="4" w:name="OLE_LINK6"/>
       <w:r>
         <w:rPr>
           <w:rFonts w:hint="eastAsia"/>
@@ -13389,7 +13383,7 @@
         </w:rPr>
         <w:t>请帮我探索这个方案。探索过程的实验基准采用最新的</w:t>
       </w:r>
-      <w:bookmarkStart w:id="6" w:name="OLE_LINK8"/>
+      <w:bookmarkStart w:id="5" w:name="OLE_LINK8"/>
       <w:r>
         <w:rPr>
           <w:rStyle w:val="ui-markdowninline-path-prefix"/>
@@ -13423,7 +13417,7 @@
         </w:rPr>
         <w:t>个程序池的实验测例</w:t>
       </w:r>
-      <w:bookmarkEnd w:id="6"/>
+      <w:bookmarkEnd w:id="5"/>
       <w:r>
         <w:rPr>
           <w:rStyle w:val="ui-markdowninline-path-filename"/>
@@ -13473,159 +13467,600 @@
         </w:rPr>
         <w:t>个程序池的结果分别总结出来。</w:t>
       </w:r>
+    </w:p>
+    <w:bookmarkEnd w:id="4"/>
+    <w:p>
+      <w:pPr>
+        <w:pStyle w:val="a4"/>
+        <w:jc w:val="both"/>
+      </w:pPr>
     </w:p>
     <w:p>
       <w:pPr>
-        <w:ind w:firstLine="0"/>
-        <w:rPr>
-          <w:rStyle w:val="ui-markdowninline-path-filename"/>
-        </w:rPr>
+        <w:pStyle w:val="a4"/>
+        <w:jc w:val="both"/>
       </w:pPr>
     </w:p>
     <w:p>
       <w:pPr>
-        <w:ind w:firstLine="0"/>
-      </w:pPr>
-      <w:bookmarkStart w:id="7" w:name="OLE_LINK9"/>
-      <w:r>
-        <w:rPr>
-          <w:rStyle w:val="ui-markdowninline-path-filename"/>
-          <w:rFonts w:hint="eastAsia"/>
-        </w:rPr>
-        <w:t>给</w:t>
-      </w:r>
-      <w:r>
-        <w:rPr>
-          <w:rStyle w:val="ui-markdowninline-path-filename"/>
-          <w:rFonts w:hint="eastAsia"/>
-        </w:rPr>
-        <w:t>GPT</w:t>
-      </w:r>
-      <w:r>
-        <w:rPr>
-          <w:rStyle w:val="ui-markdowninline-path-filename"/>
-          <w:rFonts w:hint="eastAsia"/>
-        </w:rPr>
-        <w:t>：我下一步要实现</w:t>
-      </w:r>
-      <w:r>
-        <w:rPr>
-          <w:rStyle w:val="ui-markdowninline-path-prefix"/>
-        </w:rPr>
-        <w:t>plan/</w:t>
-      </w:r>
-      <w:r>
-        <w:rPr>
-          <w:rStyle w:val="ui-markdowninline-path-filename"/>
-        </w:rPr>
-        <w:t>model_pool_compression_study_2026-09-08.html</w:t>
-      </w:r>
-      <w:r>
-        <w:rPr>
-          <w:rStyle w:val="ui-markdowninline-path-filename"/>
-          <w:rFonts w:hint="eastAsia"/>
-        </w:rPr>
-        <w:t>描述的</w:t>
-      </w:r>
-      <w:r>
-        <w:rPr>
-          <w:rStyle w:val="ui-markdowninline-path-filename"/>
-          <w:rFonts w:hint="eastAsia"/>
-        </w:rPr>
-        <w:t>3</w:t>
-      </w:r>
-      <w:r>
-        <w:rPr>
-          <w:rStyle w:val="ui-markdowninline-path-filename"/>
-          <w:rFonts w:hint="eastAsia"/>
-        </w:rPr>
-        <w:t>个程序池的实验测例。我现在已经有部分</w:t>
-      </w:r>
-      <w:proofErr w:type="spellStart"/>
-      <w:r>
-        <w:rPr>
-          <w:rStyle w:val="ui-markdowninline-path-filename"/>
-          <w:rFonts w:hint="eastAsia"/>
-        </w:rPr>
-        <w:t>sram</w:t>
-      </w:r>
-      <w:proofErr w:type="spellEnd"/>
-      <w:r>
-        <w:rPr>
-          <w:rStyle w:val="ui-markdowninline-path-filename"/>
-          <w:rFonts w:hint="eastAsia"/>
-        </w:rPr>
-        <w:t>宏，但是</w:t>
-      </w:r>
-      <w:r>
-        <w:rPr>
-          <w:rFonts w:hint="eastAsia"/>
-        </w:rPr>
-        <w:t>待完成的实验需要更深的</w:t>
-      </w:r>
-      <w:proofErr w:type="spellStart"/>
-      <w:r>
-        <w:rPr>
-          <w:rFonts w:hint="eastAsia"/>
-        </w:rPr>
-        <w:t>sram</w:t>
-      </w:r>
-      <w:proofErr w:type="spellEnd"/>
-      <w:r>
-        <w:rPr>
-          <w:rFonts w:hint="eastAsia"/>
-        </w:rPr>
-        <w:t>。请用软件模型进行面积和功耗评估，在</w:t>
-      </w:r>
-      <w:r>
-        <w:rPr>
-          <w:rFonts w:hint="eastAsia"/>
-        </w:rPr>
-        <w:t>1GHz</w:t>
-      </w:r>
-      <w:r>
-        <w:rPr>
-          <w:rFonts w:hint="eastAsia"/>
-        </w:rPr>
-        <w:t>的时钟约束下，哪些深宏适合用已有宏拼接，哪些</w:t>
-      </w:r>
-      <w:proofErr w:type="spellStart"/>
-      <w:r>
-        <w:rPr>
-          <w:rFonts w:hint="eastAsia"/>
-        </w:rPr>
-        <w:t>sram</w:t>
-      </w:r>
-      <w:proofErr w:type="spellEnd"/>
-      <w:r>
-        <w:rPr>
-          <w:rFonts w:hint="eastAsia"/>
-        </w:rPr>
-        <w:t>适合专门用</w:t>
-      </w:r>
-      <w:r>
-        <w:rPr>
-          <w:rFonts w:hint="eastAsia"/>
-        </w:rPr>
-        <w:t>MC</w:t>
-      </w:r>
-      <w:r>
-        <w:rPr>
-          <w:rFonts w:hint="eastAsia"/>
-        </w:rPr>
-        <w:t>生成专门的宏。</w:t>
-      </w:r>
-    </w:p>
-    <w:bookmarkEnd w:id="5"/>
-    <w:bookmarkEnd w:id="7"/>
-    <w:p>
-      <w:pPr>
         <w:pStyle w:val="a4"/>
         <w:jc w:val="both"/>
       </w:pPr>
     </w:p>
     <w:p>
       <w:pPr>
+        <w:pStyle w:val="2"/>
+      </w:pPr>
+      <w:r>
+        <w:t>三程序池周期数</w:t>
+      </w:r>
+      <w:r>
+        <w:t xml:space="preserve"> × Lane </w:t>
+      </w:r>
+      <w:r>
+        <w:t>数汇总</w:t>
+      </w:r>
+    </w:p>
+    <w:tbl>
+      <w:tblPr>
+        <w:tblStyle w:val="a5"/>
+        <w:tblW w:w="0" w:type="auto"/>
+        <w:tblLook w:val="04A0" w:firstRow="1" w:lastRow="0" w:firstColumn="1" w:lastColumn="0" w:noHBand="0" w:noVBand="1"/>
+      </w:tblPr>
+      <w:tblGrid>
+        <w:gridCol w:w="1068"/>
+        <w:gridCol w:w="1807"/>
+        <w:gridCol w:w="1807"/>
+        <w:gridCol w:w="1807"/>
+        <w:gridCol w:w="1807"/>
+      </w:tblGrid>
+      <w:tr>
+        <w:tc>
+          <w:tcPr>
+            <w:tcW w:w="0" w:type="auto"/>
+            <w:noWrap/>
+            <w:hideMark/>
+          </w:tcPr>
+          <w:p>
+            <w:pPr>
+              <w:rPr>
+                <w:rFonts w:ascii="宋体" w:hAnsi="宋体" w:cs="宋体"/>
+                <w:b/>
+                <w:bCs/>
+                <w:szCs w:val="24"/>
+              </w:rPr>
+            </w:pPr>
+            <w:r>
+              <w:rPr>
+                <w:b/>
+                <w:bCs/>
+              </w:rPr>
+              <w:t>程序池</w:t>
+            </w:r>
+          </w:p>
+        </w:tc>
+        <w:tc>
+          <w:tcPr>
+            <w:tcW w:w="0" w:type="auto"/>
+            <w:noWrap/>
+            <w:hideMark/>
+          </w:tcPr>
+          <w:p>
+            <w:pPr>
+              <w:jc w:val="right"/>
+              <w:rPr>
+                <w:b/>
+                <w:bCs/>
+              </w:rPr>
+            </w:pPr>
+            <w:r>
+              <w:rPr>
+                <w:b/>
+                <w:bCs/>
+              </w:rPr>
+              <w:t>lane=5</w:t>
+            </w:r>
+            <w:r>
+              <w:rPr>
+                <w:b/>
+                <w:bCs/>
+              </w:rPr>
+              <w:t>（</w:t>
+            </w:r>
+            <w:r>
+              <w:rPr>
+                <w:b/>
+                <w:bCs/>
+              </w:rPr>
+              <w:t>max-5</w:t>
+            </w:r>
+            <w:r>
+              <w:rPr>
+                <w:b/>
+                <w:bCs/>
+              </w:rPr>
+              <w:t>）</w:t>
+            </w:r>
+          </w:p>
+        </w:tc>
+        <w:tc>
+          <w:tcPr>
+            <w:tcW w:w="0" w:type="auto"/>
+            <w:noWrap/>
+            <w:hideMark/>
+          </w:tcPr>
+          <w:p>
+            <w:pPr>
+              <w:jc w:val="right"/>
+              <w:rPr>
+                <w:b/>
+                <w:bCs/>
+              </w:rPr>
+            </w:pPr>
+            <w:r>
+              <w:rPr>
+                <w:b/>
+                <w:bCs/>
+              </w:rPr>
+              <w:t>lane=4</w:t>
+            </w:r>
+            <w:r>
+              <w:rPr>
+                <w:b/>
+                <w:bCs/>
+              </w:rPr>
+              <w:t>（</w:t>
+            </w:r>
+            <w:r>
+              <w:rPr>
+                <w:b/>
+                <w:bCs/>
+              </w:rPr>
+              <w:t>max-4</w:t>
+            </w:r>
+            <w:r>
+              <w:rPr>
+                <w:b/>
+                <w:bCs/>
+              </w:rPr>
+              <w:t>）</w:t>
+            </w:r>
+          </w:p>
+        </w:tc>
+        <w:tc>
+          <w:tcPr>
+            <w:tcW w:w="0" w:type="auto"/>
+            <w:noWrap/>
+            <w:hideMark/>
+          </w:tcPr>
+          <w:p>
+            <w:pPr>
+              <w:jc w:val="right"/>
+              <w:rPr>
+                <w:b/>
+                <w:bCs/>
+              </w:rPr>
+            </w:pPr>
+            <w:r>
+              <w:rPr>
+                <w:b/>
+                <w:bCs/>
+              </w:rPr>
+              <w:t>lane=3</w:t>
+            </w:r>
+            <w:r>
+              <w:rPr>
+                <w:b/>
+                <w:bCs/>
+              </w:rPr>
+              <w:t>（</w:t>
+            </w:r>
+            <w:r>
+              <w:rPr>
+                <w:b/>
+                <w:bCs/>
+              </w:rPr>
+              <w:t>max-3</w:t>
+            </w:r>
+            <w:r>
+              <w:rPr>
+                <w:b/>
+                <w:bCs/>
+              </w:rPr>
+              <w:t>）</w:t>
+            </w:r>
+          </w:p>
+        </w:tc>
+        <w:tc>
+          <w:tcPr>
+            <w:tcW w:w="0" w:type="auto"/>
+            <w:noWrap/>
+            <w:hideMark/>
+          </w:tcPr>
+          <w:p>
+            <w:pPr>
+              <w:jc w:val="right"/>
+              <w:rPr>
+                <w:b/>
+                <w:bCs/>
+              </w:rPr>
+            </w:pPr>
+            <w:r>
+              <w:rPr>
+                <w:b/>
+                <w:bCs/>
+              </w:rPr>
+              <w:t>lane=2</w:t>
+            </w:r>
+            <w:r>
+              <w:rPr>
+                <w:b/>
+                <w:bCs/>
+              </w:rPr>
+              <w:t>（</w:t>
+            </w:r>
+            <w:r>
+              <w:rPr>
+                <w:b/>
+                <w:bCs/>
+              </w:rPr>
+              <w:t>max-2</w:t>
+            </w:r>
+            <w:r>
+              <w:rPr>
+                <w:b/>
+                <w:bCs/>
+              </w:rPr>
+              <w:t>）</w:t>
+            </w:r>
+          </w:p>
+        </w:tc>
+      </w:tr>
+      <w:tr>
+        <w:tc>
+          <w:tcPr>
+            <w:tcW w:w="0" w:type="auto"/>
+            <w:hideMark/>
+          </w:tcPr>
+          <w:p>
+            <w:pPr>
+              <w:jc w:val="left"/>
+            </w:pPr>
+            <w:r>
+              <w:t>BERT</w:t>
+            </w:r>
+            <w:r>
+              <w:t>（</w:t>
+            </w:r>
+            <w:r>
+              <w:t xml:space="preserve">4 </w:t>
+            </w:r>
+            <w:r>
+              <w:t>程序）</w:t>
+            </w:r>
+          </w:p>
+        </w:tc>
+        <w:tc>
+          <w:tcPr>
+            <w:tcW w:w="0" w:type="auto"/>
+            <w:hideMark/>
+          </w:tcPr>
+          <w:p>
+            <w:pPr>
+              <w:jc w:val="right"/>
+            </w:pPr>
+            <w:r>
+              <w:t>7,667</w:t>
+            </w:r>
+          </w:p>
+        </w:tc>
+        <w:tc>
+          <w:tcPr>
+            <w:tcW w:w="0" w:type="auto"/>
+            <w:hideMark/>
+          </w:tcPr>
+          <w:p>
+            <w:pPr>
+              <w:jc w:val="right"/>
+            </w:pPr>
+            <w:r>
+              <w:t>7,667</w:t>
+            </w:r>
+            <w:r>
+              <w:t>（</w:t>
+            </w:r>
+            <w:r>
+              <w:t>100.0%</w:t>
+            </w:r>
+            <w:r>
+              <w:t>）</w:t>
+            </w:r>
+          </w:p>
+        </w:tc>
+        <w:tc>
+          <w:tcPr>
+            <w:tcW w:w="0" w:type="auto"/>
+            <w:hideMark/>
+          </w:tcPr>
+          <w:p>
+            <w:pPr>
+              <w:jc w:val="right"/>
+            </w:pPr>
+            <w:r>
+              <w:t>7,620</w:t>
+            </w:r>
+            <w:r>
+              <w:t>（</w:t>
+            </w:r>
+            <w:r>
+              <w:t>99.4%</w:t>
+            </w:r>
+            <w:r>
+              <w:t>）</w:t>
+            </w:r>
+          </w:p>
+        </w:tc>
+        <w:tc>
+          <w:tcPr>
+            <w:tcW w:w="0" w:type="auto"/>
+            <w:hideMark/>
+          </w:tcPr>
+          <w:p>
+            <w:pPr>
+              <w:jc w:val="right"/>
+            </w:pPr>
+            <w:r>
+              <w:t>7,838</w:t>
+            </w:r>
+            <w:r>
+              <w:t>（</w:t>
+            </w:r>
+            <w:r>
+              <w:t>102.2%</w:t>
+            </w:r>
+            <w:r>
+              <w:t>）</w:t>
+            </w:r>
+          </w:p>
+        </w:tc>
+      </w:tr>
+      <w:tr>
+        <w:tc>
+          <w:tcPr>
+            <w:tcW w:w="0" w:type="auto"/>
+            <w:hideMark/>
+          </w:tcPr>
+          <w:p>
+            <w:pPr>
+              <w:jc w:val="left"/>
+            </w:pPr>
+            <w:r>
+              <w:t>SD-</w:t>
+            </w:r>
+            <w:proofErr w:type="spellStart"/>
+            <w:r>
+              <w:t>UNet</w:t>
+            </w:r>
+            <w:proofErr w:type="spellEnd"/>
+            <w:r>
+              <w:t>（</w:t>
+            </w:r>
+            <w:r>
+              <w:t xml:space="preserve">5 </w:t>
+            </w:r>
+            <w:r>
+              <w:t>程序）</w:t>
+            </w:r>
+          </w:p>
+        </w:tc>
+        <w:tc>
+          <w:tcPr>
+            <w:tcW w:w="0" w:type="auto"/>
+            <w:hideMark/>
+          </w:tcPr>
+          <w:p>
+            <w:pPr>
+              <w:jc w:val="right"/>
+            </w:pPr>
+            <w:r>
+              <w:t>11,684</w:t>
+            </w:r>
+          </w:p>
+        </w:tc>
+        <w:tc>
+          <w:tcPr>
+            <w:tcW w:w="0" w:type="auto"/>
+            <w:hideMark/>
+          </w:tcPr>
+          <w:p>
+            <w:pPr>
+              <w:jc w:val="right"/>
+            </w:pPr>
+            <w:r>
+              <w:t>11,684</w:t>
+            </w:r>
+            <w:r>
+              <w:t>（</w:t>
+            </w:r>
+            <w:r>
+              <w:t>100.0%</w:t>
+            </w:r>
+            <w:r>
+              <w:t>）</w:t>
+            </w:r>
+          </w:p>
+        </w:tc>
+        <w:tc>
+          <w:tcPr>
+            <w:tcW w:w="0" w:type="auto"/>
+            <w:hideMark/>
+          </w:tcPr>
+          <w:p>
+            <w:pPr>
+              <w:jc w:val="right"/>
+            </w:pPr>
+            <w:r>
+              <w:t>11,650</w:t>
+            </w:r>
+            <w:r>
+              <w:t>（</w:t>
+            </w:r>
+            <w:r>
+              <w:t>99.7%</w:t>
+            </w:r>
+            <w:r>
+              <w:t>）</w:t>
+            </w:r>
+          </w:p>
+        </w:tc>
+        <w:tc>
+          <w:tcPr>
+            <w:tcW w:w="0" w:type="auto"/>
+            <w:hideMark/>
+          </w:tcPr>
+          <w:p>
+            <w:pPr>
+              <w:jc w:val="right"/>
+            </w:pPr>
+            <w:r>
+              <w:t>11,655</w:t>
+            </w:r>
+            <w:r>
+              <w:t>（</w:t>
+            </w:r>
+            <w:r>
+              <w:t>99.8%</w:t>
+            </w:r>
+            <w:r>
+              <w:t>）</w:t>
+            </w:r>
+          </w:p>
+        </w:tc>
+      </w:tr>
+      <w:tr>
+        <w:tc>
+          <w:tcPr>
+            <w:tcW w:w="0" w:type="auto"/>
+            <w:hideMark/>
+          </w:tcPr>
+          <w:p>
+            <w:pPr>
+              <w:jc w:val="left"/>
+            </w:pPr>
+            <w:proofErr w:type="spellStart"/>
+            <w:r>
+              <w:t>LLaMA</w:t>
+            </w:r>
+            <w:proofErr w:type="spellEnd"/>
+            <w:r>
+              <w:t>（</w:t>
+            </w:r>
+            <w:r>
+              <w:t xml:space="preserve">3 </w:t>
+            </w:r>
+            <w:r>
+              <w:t>程序）</w:t>
+            </w:r>
+          </w:p>
+        </w:tc>
+        <w:tc>
+          <w:tcPr>
+            <w:tcW w:w="0" w:type="auto"/>
+            <w:hideMark/>
+          </w:tcPr>
+          <w:p>
+            <w:pPr>
+              <w:jc w:val="right"/>
+            </w:pPr>
+            <w:r>
+              <w:t>30,704</w:t>
+            </w:r>
+          </w:p>
+        </w:tc>
+        <w:tc>
+          <w:tcPr>
+            <w:tcW w:w="0" w:type="auto"/>
+            <w:hideMark/>
+          </w:tcPr>
+          <w:p>
+            <w:pPr>
+              <w:jc w:val="right"/>
+            </w:pPr>
+            <w:r>
+              <w:t>30,704</w:t>
+            </w:r>
+            <w:r>
+              <w:t>（</w:t>
+            </w:r>
+            <w:r>
+              <w:t>100.0%</w:t>
+            </w:r>
+            <w:r>
+              <w:t>）</w:t>
+            </w:r>
+          </w:p>
+        </w:tc>
+        <w:tc>
+          <w:tcPr>
+            <w:tcW w:w="0" w:type="auto"/>
+            <w:hideMark/>
+          </w:tcPr>
+          <w:p>
+            <w:pPr>
+              <w:jc w:val="right"/>
+            </w:pPr>
+            <w:r>
+              <w:t>30,698</w:t>
+            </w:r>
+            <w:r>
+              <w:t>（</w:t>
+            </w:r>
+            <w:r>
+              <w:t>100.0%</w:t>
+            </w:r>
+            <w:r>
+              <w:t>）</w:t>
+            </w:r>
+          </w:p>
+        </w:tc>
+        <w:tc>
+          <w:tcPr>
+            <w:tcW w:w="0" w:type="auto"/>
+            <w:hideMark/>
+          </w:tcPr>
+          <w:p>
+            <w:pPr>
+              <w:jc w:val="right"/>
+            </w:pPr>
+            <w:r>
+              <w:t>30,871</w:t>
+            </w:r>
+            <w:r>
+              <w:t>（</w:t>
+            </w:r>
+            <w:r>
+              <w:t>100.5%</w:t>
+            </w:r>
+            <w:r>
+              <w:t>）</w:t>
+            </w:r>
+          </w:p>
+        </w:tc>
+      </w:tr>
+    </w:tbl>
+    <w:p>
+      <w:r>
+        <w:t>括号内为相对</w:t>
+      </w:r>
+      <w:r>
+        <w:t xml:space="preserve"> lane=5 </w:t>
+      </w:r>
+      <w:r>
+        <w:t>的百分比。</w:t>
+      </w:r>
+    </w:p>
+    <w:p>
+      <w:pPr>
         <w:pStyle w:val="a4"/>
         <w:jc w:val="both"/>
       </w:pPr>
@@ -13645,24 +14080,74 @@
     <w:p>
       <w:pPr>
         <w:pStyle w:val="a4"/>
-        <w:jc w:val="both"/>
       </w:pPr>
     </w:p>
     <w:p>
       <w:pPr>
         <w:pStyle w:val="a4"/>
-        <w:jc w:val="both"/>
       </w:pPr>
     </w:p>
     <w:p>
       <w:pPr>
-        <w:pStyle w:val="a4"/>
-      </w:pPr>
+        <w:rPr>
+          <w:rFonts w:ascii="Cambria" w:hAnsi="Cambria" w:cs="Cambria"/>
+        </w:rPr>
+      </w:pPr>
+      <w:r>
+        <w:rPr>
+          <w:rFonts w:hint="eastAsia"/>
+        </w:rPr>
+        <w:t>每周期必须</w:t>
+      </w:r>
+      <w:r>
+        <w:rPr>
+          <w:rFonts w:ascii="Cambria" w:hAnsi="Cambria" w:cs="Cambria" w:hint="eastAsia"/>
+        </w:rPr>
+        <w:t>恢复一条完整指令，每个槽一样宽。</w:t>
+      </w:r>
     </w:p>
     <w:p>
       <w:pPr>
-        <w:pStyle w:val="a4"/>
-      </w:pPr>
+        <w:rPr>
+          <w:rFonts w:ascii="Cambria" w:hAnsi="Cambria" w:cs="Cambria"/>
+        </w:rPr>
+      </w:pPr>
+      <w:r>
+        <w:rPr>
+          <w:rFonts w:ascii="Cambria" w:hAnsi="Cambria" w:cs="Cambria" w:hint="eastAsia"/>
+        </w:rPr>
+        <w:t>N bank  -</w:t>
+      </w:r>
+      <w:r>
+        <w:rPr>
+          <w:rFonts w:ascii="Cambria" w:hAnsi="Cambria" w:cs="Cambria"/>
+        </w:rPr>
+        <w:t>&gt;</w:t>
+      </w:r>
+      <w:r>
+        <w:rPr>
+          <w:rFonts w:ascii="Cambria" w:hAnsi="Cambria" w:cs="Cambria" w:hint="eastAsia"/>
+        </w:rPr>
+        <w:t xml:space="preserve">  </w:t>
+      </w:r>
+      <w:r>
+        <w:rPr>
+          <w:rFonts w:ascii="Cambria" w:hAnsi="Cambria" w:cs="Cambria" w:hint="eastAsia"/>
+        </w:rPr>
+        <w:t>一周期</w:t>
+      </w:r>
+      <w:r>
+        <w:rPr>
+          <w:rFonts w:ascii="Cambria" w:hAnsi="Cambria" w:cs="Cambria" w:hint="eastAsia"/>
+        </w:rPr>
+        <w:t>N</w:t>
+      </w:r>
+      <w:r>
+        <w:rPr>
+          <w:rFonts w:ascii="Cambria" w:hAnsi="Cambria" w:cs="Cambria" w:hint="eastAsia"/>
+        </w:rPr>
+        <w:t>有效槽（不会太影响性能）。</w:t>
+      </w:r>
     </w:p>
     <w:p>
       <w:pPr>
@@ -13670,17 +14155,37 @@
           <w:rFonts w:ascii="Cambria" w:hAnsi="Cambria" w:cs="Cambria"/>
         </w:rPr>
       </w:pPr>
-      <w:r>
-        <w:rPr>
-          <w:rFonts w:hint="eastAsia"/>
-        </w:rPr>
-        <w:t>每周期必须</w:t>
-      </w:r>
+      <w:bookmarkStart w:id="6" w:name="OLE_LINK3"/>
       <w:r>
         <w:rPr>
           <w:rFonts w:ascii="Cambria" w:hAnsi="Cambria" w:cs="Cambria" w:hint="eastAsia"/>
         </w:rPr>
-        <w:t>恢复一条完整指令，每个槽一样宽。</w:t>
+        <w:t>完整指令</w:t>
+      </w:r>
+      <w:r>
+        <w:rPr>
+          <w:rFonts w:ascii="Cambria" w:hAnsi="Cambria" w:cs="Cambria" w:hint="eastAsia"/>
+        </w:rPr>
+        <w:t>M</w:t>
+      </w:r>
+      <w:r>
+        <w:rPr>
+          <w:rFonts w:ascii="Cambria" w:hAnsi="Cambria" w:cs="Cambria" w:hint="eastAsia"/>
+        </w:rPr>
+        <w:t>个槽</w:t>
+      </w:r>
+      <w:r>
+        <w:rPr>
+          <w:rFonts w:ascii="Cambria" w:hAnsi="Cambria" w:cs="Cambria"/>
+        </w:rPr>
+        <w:t xml:space="preserve">&gt;=N.  </w:t>
+      </w:r>
+      <w:bookmarkEnd w:id="6"/>
+      <w:r>
+        <w:rPr>
+          <w:rFonts w:ascii="Cambria" w:hAnsi="Cambria" w:cs="Cambria"/>
+        </w:rPr>
+        <w:t xml:space="preserve">  </w:t>
       </w:r>
     </w:p>
     <w:p>
@@ -13691,39 +14196,23 @@
       </w:pPr>
       <w:r>
         <w:rPr>
-          <w:rFonts w:ascii="Cambria" w:hAnsi="Cambria" w:cs="Cambria" w:hint="eastAsia"/>
-        </w:rPr>
-        <w:t>N bank  -</w:t>
-      </w:r>
-      <w:r>
-        <w:rPr>
           <w:rFonts w:ascii="Cambria" w:hAnsi="Cambria" w:cs="Cambria"/>
         </w:rPr>
-        <w:t>&gt;</w:t>
-      </w:r>
-      <w:r>
-        <w:rPr>
-          <w:rFonts w:ascii="Cambria" w:hAnsi="Cambria" w:cs="Cambria" w:hint="eastAsia"/>
-        </w:rPr>
-        <w:t xml:space="preserve">  </w:t>
-      </w:r>
-      <w:r>
-        <w:rPr>
-          <w:rFonts w:ascii="Cambria" w:hAnsi="Cambria" w:cs="Cambria" w:hint="eastAsia"/>
-        </w:rPr>
-        <w:t>一周期</w:t>
-      </w:r>
-      <w:r>
-        <w:rPr>
-          <w:rFonts w:ascii="Cambria" w:hAnsi="Cambria" w:cs="Cambria" w:hint="eastAsia"/>
-        </w:rPr>
-        <w:t>N</w:t>
-      </w:r>
-      <w:r>
-        <w:rPr>
-          <w:rFonts w:ascii="Cambria" w:hAnsi="Cambria" w:cs="Cambria" w:hint="eastAsia"/>
-        </w:rPr>
-        <w:t>有效槽（不会太影响性能）。</w:t>
+        <w:t xml:space="preserve">mask </w:t>
+      </w:r>
+      <w:proofErr w:type="spellStart"/>
+      <w:r>
+        <w:rPr>
+          <w:rFonts w:ascii="Cambria" w:hAnsi="Cambria" w:cs="Cambria"/>
+        </w:rPr>
+        <w:t>sram</w:t>
+      </w:r>
+      <w:proofErr w:type="spellEnd"/>
+      <w:r>
+        <w:rPr>
+          <w:rFonts w:ascii="Cambria" w:hAnsi="Cambria" w:cs="Cambria"/>
+        </w:rPr>
+        <w:t xml:space="preserve"> M * T</w:t>
       </w:r>
     </w:p>
     <w:p>
@@ -13732,38 +14221,55 @@
           <w:rFonts w:ascii="Cambria" w:hAnsi="Cambria" w:cs="Cambria"/>
         </w:rPr>
       </w:pPr>
-      <w:bookmarkStart w:id="8" w:name="OLE_LINK3"/>
+      <w:r>
+        <w:rPr>
+          <w:rFonts w:ascii="Cambria" w:hAnsi="Cambria" w:cs="Cambria"/>
+        </w:rPr>
+        <w:t xml:space="preserve">instruction </w:t>
+      </w:r>
+      <w:proofErr w:type="spellStart"/>
+      <w:r>
+        <w:rPr>
+          <w:rFonts w:ascii="Cambria" w:hAnsi="Cambria" w:cs="Cambria"/>
+        </w:rPr>
+        <w:t>sram</w:t>
+      </w:r>
+      <w:proofErr w:type="spellEnd"/>
+      <w:r>
+        <w:rPr>
+          <w:rFonts w:ascii="Cambria" w:hAnsi="Cambria" w:cs="Cambria"/>
+        </w:rPr>
+        <w:t xml:space="preserve"> </w:t>
+      </w:r>
       <w:r>
         <w:rPr>
           <w:rFonts w:ascii="Cambria" w:hAnsi="Cambria" w:cs="Cambria" w:hint="eastAsia"/>
         </w:rPr>
-        <w:lastRenderedPageBreak/>
-        <w:t>完整指令</w:t>
+        <w:t>：有效槽的量（</w:t>
       </w:r>
       <w:r>
         <w:rPr>
           <w:rFonts w:ascii="Cambria" w:hAnsi="Cambria" w:cs="Cambria" w:hint="eastAsia"/>
         </w:rPr>
-        <w:t>M</w:t>
+        <w:t>pad</w:t>
       </w:r>
       <w:r>
         <w:rPr>
           <w:rFonts w:ascii="Cambria" w:hAnsi="Cambria" w:cs="Cambria" w:hint="eastAsia"/>
         </w:rPr>
-        <w:t>个槽</w:t>
-      </w:r>
-      <w:r>
-        <w:rPr>
-          <w:rFonts w:ascii="Cambria" w:hAnsi="Cambria" w:cs="Cambria"/>
-        </w:rPr>
-        <w:t xml:space="preserve">&gt;=N.  </w:t>
-      </w:r>
-      <w:bookmarkEnd w:id="8"/>
-      <w:r>
-        <w:rPr>
-          <w:rFonts w:ascii="Cambria" w:hAnsi="Cambria" w:cs="Cambria"/>
-        </w:rPr>
-        <w:t xml:space="preserve">  </w:t>
+        <w:t>到</w:t>
+      </w:r>
+      <w:r>
+        <w:rPr>
+          <w:rFonts w:ascii="Cambria" w:hAnsi="Cambria" w:cs="Cambria" w:hint="eastAsia"/>
+        </w:rPr>
+        <w:t>2</w:t>
+      </w:r>
+      <w:r>
+        <w:rPr>
+          <w:rFonts w:ascii="Cambria" w:hAnsi="Cambria" w:cs="Cambria" w:hint="eastAsia"/>
+        </w:rPr>
+        <w:t>的幂）。</w:t>
       </w:r>
     </w:p>
     <w:p>
@@ -13772,26 +14278,6 @@
           <w:rFonts w:ascii="Cambria" w:hAnsi="Cambria" w:cs="Cambria"/>
         </w:rPr>
       </w:pPr>
-      <w:r>
-        <w:rPr>
-          <w:rFonts w:ascii="Cambria" w:hAnsi="Cambria" w:cs="Cambria"/>
-        </w:rPr>
-        <w:t xml:space="preserve">mask </w:t>
-      </w:r>
-      <w:proofErr w:type="spellStart"/>
-      <w:r>
-        <w:rPr>
-          <w:rFonts w:ascii="Cambria" w:hAnsi="Cambria" w:cs="Cambria"/>
-        </w:rPr>
-        <w:t>sram</w:t>
-      </w:r>
-      <w:proofErr w:type="spellEnd"/>
-      <w:r>
-        <w:rPr>
-          <w:rFonts w:ascii="Cambria" w:hAnsi="Cambria" w:cs="Cambria"/>
-        </w:rPr>
-        <w:t xml:space="preserve"> M * T</w:t>
-      </w:r>
     </w:p>
     <w:p>
       <w:pPr>
@@ -13801,53 +14287,21 @@
       </w:pPr>
       <w:r>
         <w:rPr>
-          <w:rFonts w:ascii="Cambria" w:hAnsi="Cambria" w:cs="Cambria"/>
-        </w:rPr>
-        <w:t xml:space="preserve">instruction </w:t>
-      </w:r>
-      <w:proofErr w:type="spellStart"/>
-      <w:r>
-        <w:rPr>
-          <w:rFonts w:ascii="Cambria" w:hAnsi="Cambria" w:cs="Cambria"/>
-        </w:rPr>
-        <w:t>sram</w:t>
-      </w:r>
-      <w:proofErr w:type="spellEnd"/>
-      <w:r>
-        <w:rPr>
-          <w:rFonts w:ascii="Cambria" w:hAnsi="Cambria" w:cs="Cambria"/>
-        </w:rPr>
-        <w:t xml:space="preserve"> </w:t>
-      </w:r>
-      <w:r>
-        <w:rPr>
           <w:rFonts w:ascii="Cambria" w:hAnsi="Cambria" w:cs="Cambria" w:hint="eastAsia"/>
         </w:rPr>
-        <w:t>：有效槽的量（</w:t>
+        <w:t>搜其他论文</w:t>
       </w:r>
       <w:r>
         <w:rPr>
           <w:rFonts w:ascii="Cambria" w:hAnsi="Cambria" w:cs="Cambria" w:hint="eastAsia"/>
         </w:rPr>
-        <w:t>pad</w:t>
+        <w:t>/</w:t>
       </w:r>
       <w:r>
         <w:rPr>
           <w:rFonts w:ascii="Cambria" w:hAnsi="Cambria" w:cs="Cambria" w:hint="eastAsia"/>
         </w:rPr>
-        <w:t>到</w:t>
-      </w:r>
-      <w:r>
-        <w:rPr>
-          <w:rFonts w:ascii="Cambria" w:hAnsi="Cambria" w:cs="Cambria" w:hint="eastAsia"/>
-        </w:rPr>
-        <w:t>2</w:t>
-      </w:r>
-      <w:r>
-        <w:rPr>
-          <w:rFonts w:ascii="Cambria" w:hAnsi="Cambria" w:cs="Cambria" w:hint="eastAsia"/>
-        </w:rPr>
-        <w:t>的幂）。</w:t>
+        <w:t>处理器还有什么可以用这个方法。需要满足以下条件：</w:t>
       </w:r>
     </w:p>
     <w:p>
@@ -13856,6 +14310,19 @@
           <w:rFonts w:ascii="Cambria" w:hAnsi="Cambria" w:cs="Cambria"/>
         </w:rPr>
       </w:pPr>
+      <w:bookmarkStart w:id="7" w:name="OLE_LINK4"/>
+      <w:r>
+        <w:rPr>
+          <w:rFonts w:hint="eastAsia"/>
+        </w:rPr>
+        <w:t>每周期必须</w:t>
+      </w:r>
+      <w:r>
+        <w:rPr>
+          <w:rFonts w:ascii="Cambria" w:hAnsi="Cambria" w:cs="Cambria" w:hint="eastAsia"/>
+        </w:rPr>
+        <w:t>恢复一条完整指令，每个槽一样宽。</w:t>
+      </w:r>
     </w:p>
     <w:p>
       <w:pPr>
@@ -13867,19 +14334,25 @@
         <w:rPr>
           <w:rFonts w:ascii="Cambria" w:hAnsi="Cambria" w:cs="Cambria" w:hint="eastAsia"/>
         </w:rPr>
-        <w:t>搜其他论文</w:t>
+        <w:t>完整指令</w:t>
       </w:r>
       <w:r>
         <w:rPr>
           <w:rFonts w:ascii="Cambria" w:hAnsi="Cambria" w:cs="Cambria" w:hint="eastAsia"/>
         </w:rPr>
-        <w:t>/</w:t>
+        <w:t>M</w:t>
       </w:r>
       <w:r>
         <w:rPr>
           <w:rFonts w:ascii="Cambria" w:hAnsi="Cambria" w:cs="Cambria" w:hint="eastAsia"/>
         </w:rPr>
-        <w:t>处理器还有什么可以用这个方法。需要满足以下条件：</w:t>
+        <w:t>个槽</w:t>
+      </w:r>
+      <w:r>
+        <w:rPr>
+          <w:rFonts w:ascii="Cambria" w:hAnsi="Cambria" w:cs="Cambria"/>
+        </w:rPr>
+        <w:t xml:space="preserve">&gt;=N.  </w:t>
       </w:r>
     </w:p>
     <w:p>
@@ -13888,94 +14361,43 @@
           <w:rFonts w:ascii="Cambria" w:hAnsi="Cambria" w:cs="Cambria"/>
         </w:rPr>
       </w:pPr>
-      <w:bookmarkStart w:id="9" w:name="OLE_LINK4"/>
-      <w:r>
-        <w:rPr>
-          <w:rFonts w:hint="eastAsia"/>
-        </w:rPr>
-        <w:t>每周期必须</w:t>
-      </w:r>
       <w:r>
         <w:rPr>
           <w:rFonts w:ascii="Cambria" w:hAnsi="Cambria" w:cs="Cambria" w:hint="eastAsia"/>
         </w:rPr>
-        <w:t>恢复一条完整指令，每个槽一样宽。</w:t>
-      </w:r>
-    </w:p>
-    <w:p>
-      <w:pPr>
+        <w:t>N bank  -</w:t>
+      </w:r>
+      <w:r>
         <w:rPr>
           <w:rFonts w:ascii="Cambria" w:hAnsi="Cambria" w:cs="Cambria"/>
         </w:rPr>
-      </w:pPr>
+        <w:t>&gt;</w:t>
+      </w:r>
       <w:r>
         <w:rPr>
           <w:rFonts w:ascii="Cambria" w:hAnsi="Cambria" w:cs="Cambria" w:hint="eastAsia"/>
         </w:rPr>
-        <w:t>完整指令</w:t>
+        <w:t xml:space="preserve">  </w:t>
       </w:r>
       <w:r>
         <w:rPr>
           <w:rFonts w:ascii="Cambria" w:hAnsi="Cambria" w:cs="Cambria" w:hint="eastAsia"/>
         </w:rPr>
-        <w:t>M</w:t>
+        <w:t>一周期</w:t>
       </w:r>
       <w:r>
         <w:rPr>
           <w:rFonts w:ascii="Cambria" w:hAnsi="Cambria" w:cs="Cambria" w:hint="eastAsia"/>
         </w:rPr>
-        <w:t>个槽</w:t>
-      </w:r>
-      <w:r>
-        <w:rPr>
-          <w:rFonts w:ascii="Cambria" w:hAnsi="Cambria" w:cs="Cambria"/>
-        </w:rPr>
-        <w:t xml:space="preserve">&gt;=N.  </w:t>
-      </w:r>
-    </w:p>
-    <w:p>
-      <w:pPr>
-        <w:rPr>
-          <w:rFonts w:ascii="Cambria" w:hAnsi="Cambria" w:cs="Cambria"/>
-        </w:rPr>
-      </w:pPr>
+        <w:t>N</w:t>
+      </w:r>
       <w:r>
         <w:rPr>
           <w:rFonts w:ascii="Cambria" w:hAnsi="Cambria" w:cs="Cambria" w:hint="eastAsia"/>
         </w:rPr>
-        <w:t>N bank  -</w:t>
-      </w:r>
-      <w:r>
-        <w:rPr>
-          <w:rFonts w:ascii="Cambria" w:hAnsi="Cambria" w:cs="Cambria"/>
-        </w:rPr>
-        <w:t>&gt;</w:t>
-      </w:r>
-      <w:r>
-        <w:rPr>
-          <w:rFonts w:ascii="Cambria" w:hAnsi="Cambria" w:cs="Cambria" w:hint="eastAsia"/>
-        </w:rPr>
-        <w:t xml:space="preserve">  </w:t>
-      </w:r>
-      <w:r>
-        <w:rPr>
-          <w:rFonts w:ascii="Cambria" w:hAnsi="Cambria" w:cs="Cambria" w:hint="eastAsia"/>
-        </w:rPr>
-        <w:t>一周期</w:t>
-      </w:r>
-      <w:r>
-        <w:rPr>
-          <w:rFonts w:ascii="Cambria" w:hAnsi="Cambria" w:cs="Cambria" w:hint="eastAsia"/>
-        </w:rPr>
-        <w:t>N</w:t>
-      </w:r>
-      <w:r>
-        <w:rPr>
-          <w:rFonts w:ascii="Cambria" w:hAnsi="Cambria" w:cs="Cambria" w:hint="eastAsia"/>
-        </w:rPr>
         <w:t>有效槽（不会太影响性能）</w:t>
       </w:r>
-      <w:bookmarkEnd w:id="9"/>
+      <w:bookmarkEnd w:id="7"/>
       <w:r>
         <w:rPr>
           <w:rFonts w:ascii="Cambria" w:hAnsi="Cambria" w:cs="Cambria" w:hint="eastAsia"/>
@@ -14176,7 +14598,7 @@
 </file>
 
 <file path=word/numbering.xml><?xml version="1.0" encoding="utf-8"?>
-<w:numbering xmlns:wpc="http://schemas.microsoft.com/office/word/2010/wordprocessingCanvas" xmlns:cx="http://schemas.microsoft.com/office/drawing/2014/chartex" xmlns:cx1="http://schemas.microsoft.com/office/drawing/2015/9/8/chartex" xmlns:cx2="http://schemas.microsoft.com/office/drawing/2015/10/21/chartex" xmlns:cx3="http://schemas.microsoft.com/office/drawing/2016/5/9/chartex" xmlns:cx4="http://schemas.microsoft.com/office/drawing/2016/5/10/chartex" xmlns:cx5="http://schemas.microsoft.com/office/drawing/2016/5/11/chartex" xmlns:cx6="http://schemas.microsoft.com/office/drawing/2016/5/12/chartex" xmlns:cx7="http://schemas.microsoft.com/office/drawing/2016/5/13/chartex" xmlns:cx8="http://schemas.microsoft.com/office/drawing/2016/5/14/chartex" xmlns:mc="http://schemas.openxmlformats.org/markup-compatibility/2006" xmlns:aink="http://schemas.microsoft.com/office/drawing/2016/ink" xmlns:am3d="http://schemas.microsoft.com/office/drawing/2017/model3d" xmlns:o="urn:schemas-microsoft-com:office:office" xmlns:r="http://schemas.openxmlformats.org/officeDocument/2006/relationships" xmlns:m="http://schemas.openxmlformats.org/officeDocument/2006/math" xmlns:v="urn:schemas-microsoft-com:vml" xmlns:wp14="http://schemas.microsoft.com/office/word/2010/wordprocessingDrawing" xmlns:wp="http://schemas.openxmlformats.org/drawingml/2006/wordprocessingDrawing" xmlns:w10="urn:schemas-microsoft-com:office:word" xmlns:w="http://schemas.openxmlformats.org/wordprocessingml/2006/main" xmlns:w14="http://schemas.microsoft.com/office/word/2010/wordml" xmlns:w15="http://schemas.microsoft.com/office/word/2012/wordml" xmlns:w16cid="http://schemas.microsoft.com/office/word/2016/wordml/cid" xmlns:w16se="http://schemas.microsoft.com/office/word/2015/wordml/symex" xmlns:wpg="http://schemas.microsoft.com/office/word/2010/wordprocessingGroup" xmlns:wpi="http://schemas.microsoft.com/office/word/2010/wordprocessingInk" xmlns:wne="http://schemas.microsoft.com/office/word/2006/wordml" xmlns:wps="http://schemas.microsoft.com/office/word/2010/wordprocessingShape" mc:Ignorable="w14 w15 w16se w16cid wp14">
+<w:numbering xmlns:wpc="http://schemas.microsoft.com/office/word/2010/wordprocessingCanvas" xmlns:cx="http://schemas.microsoft.com/office/drawing/2014/chartex" xmlns:cx1="http://schemas.microsoft.com/office/drawing/2015/9/8/chartex" xmlns:cx2="http://schemas.microsoft.com/office/drawing/2015/10/21/chartex" xmlns:cx3="http://schemas.microsoft.com/office/drawing/2016/5/9/chartex" xmlns:cx4="http://schemas.microsoft.com/office/drawing/2016/5/10/chartex" xmlns:cx5="http://schemas.microsoft.com/office/drawing/2016/5/11/chartex" xmlns:cx6="http://schemas.microsoft.com/office/drawing/2016/5/12/chartex" xmlns:cx7="http://schemas.microsoft.com/office/drawing/2016/5/13/chartex" xmlns:cx8="http://schemas.microsoft.com/office/drawing/2016/5/14/chartex" xmlns:mc="http://schemas.openxmlformats.org/markup-compatibility/2006" xmlns:m="http://schemas.openxmlformats.org/officeDocument/2006/math" xmlns:aink="http://schemas.microsoft.com/office/drawing/2016/ink" xmlns:am3d="http://schemas.microsoft.com/office/drawing/2017/model3d" xmlns:oel="http://schemas.microsoft.com/office/2019/extlst" xmlns:r="http://schemas.openxmlformats.org/officeDocument/2006/relationships" xmlns:wp14="http://schemas.microsoft.com/office/word/2010/wordprocessingDrawing" xmlns:wp="http://schemas.openxmlformats.org/drawingml/2006/wordprocessingDrawing" xmlns:wpg="http://schemas.microsoft.com/office/word/2010/wordprocessingGroup" xmlns:wpi="http://schemas.microsoft.com/office/word/2010/wordprocessingInk" xmlns:wps="http://schemas.microsoft.com/office/word/2010/wordprocessingShape" xmlns:o="urn:schemas-microsoft-com:office:office" xmlns:v="urn:schemas-microsoft-com:vml" xmlns:w10="urn:schemas-microsoft-com:office:word" xmlns:w="http://schemas.openxmlformats.org/wordprocessingml/2006/main" xmlns:w14="http://schemas.microsoft.com/office/word/2010/wordml" xmlns:w15="http://schemas.microsoft.com/office/word/2012/wordml" xmlns:w16cex="http://schemas.microsoft.com/office/word/2018/wordml/cex" xmlns:w16cid="http://schemas.microsoft.com/office/word/2016/wordml/cid" xmlns:w16="http://schemas.microsoft.com/office/word/2018/wordml" xmlns:w16sdtdh="http://schemas.microsoft.com/office/word/2020/wordml/sdtdatahash" xmlns:w16sdtfl="http://schemas.microsoft.com/office/word/2024/wordml/sdtformatlock" xmlns:w16se="http://schemas.microsoft.com/office/word/2015/wordml/symex" xmlns:w16du="http://schemas.microsoft.com/office/word/2023/wordml/word16du" xmlns:wne="http://schemas.microsoft.com/office/word/2006/wordml" mc:Ignorable="w14 w15 w16se w16cid w16 w16cex w16sdtdh w16sdtfl w16du wp14">
   <w:abstractNum w:abstractNumId="0" w15:restartNumberingAfterBreak="0">
     <w:nsid w:val="1786201A"/>
     <w:multiLevelType w:val="multilevel"/>
@@ -15475,41 +15897,41 @@
       </w:pPr>
     </w:lvl>
   </w:abstractNum>
-  <w:num w:numId="1">
+  <w:num w:numId="1" w16cid:durableId="424230457">
     <w:abstractNumId w:val="1"/>
   </w:num>
-  <w:num w:numId="2">
+  <w:num w:numId="2" w16cid:durableId="2119988645">
     <w:abstractNumId w:val="6"/>
   </w:num>
-  <w:num w:numId="3">
+  <w:num w:numId="3" w16cid:durableId="1797989388">
     <w:abstractNumId w:val="7"/>
   </w:num>
-  <w:num w:numId="4">
+  <w:num w:numId="4" w16cid:durableId="2144036779">
     <w:abstractNumId w:val="9"/>
   </w:num>
-  <w:num w:numId="5">
+  <w:num w:numId="5" w16cid:durableId="727874050">
     <w:abstractNumId w:val="8"/>
   </w:num>
-  <w:num w:numId="6">
+  <w:num w:numId="6" w16cid:durableId="1399591350">
     <w:abstractNumId w:val="5"/>
   </w:num>
-  <w:num w:numId="7">
+  <w:num w:numId="7" w16cid:durableId="329220014">
     <w:abstractNumId w:val="0"/>
   </w:num>
-  <w:num w:numId="8">
+  <w:num w:numId="8" w16cid:durableId="2058814233">
     <w:abstractNumId w:val="4"/>
   </w:num>
-  <w:num w:numId="9">
+  <w:num w:numId="9" w16cid:durableId="637492576">
     <w:abstractNumId w:val="3"/>
   </w:num>
-  <w:num w:numId="10">
+  <w:num w:numId="10" w16cid:durableId="119812416">
     <w:abstractNumId w:val="2"/>
   </w:num>
 </w:numbering>
 </file>
 
 <file path=word/styles.xml><?xml version="1.0" encoding="utf-8"?>
-<w:styles xmlns:mc="http://schemas.openxmlformats.org/markup-compatibility/2006" xmlns:r="http://schemas.openxmlformats.org/officeDocument/2006/relationships" xmlns:w="http://schemas.openxmlformats.org/wordprocessingml/2006/main" xmlns:w14="http://schemas.microsoft.com/office/word/2010/wordml" xmlns:w15="http://schemas.microsoft.com/office/word/2012/wordml" xmlns:w16cid="http://schemas.microsoft.com/office/word/2016/wordml/cid" xmlns:w16se="http://schemas.microsoft.com/office/word/2015/wordml/symex" mc:Ignorable="w14 w15 w16se w16cid">
+<w:styles xmlns:mc="http://schemas.openxmlformats.org/markup-compatibility/2006" xmlns:r="http://schemas.openxmlformats.org/officeDocument/2006/relationships" xmlns:w="http://schemas.openxmlformats.org/wordprocessingml/2006/main" xmlns:w14="http://schemas.microsoft.com/office/word/2010/wordml" xmlns:w15="http://schemas.microsoft.com/office/word/2012/wordml" xmlns:w16cex="http://schemas.microsoft.com/office/word/2018/wordml/cex" xmlns:w16cid="http://schemas.microsoft.com/office/word/2016/wordml/cid" xmlns:w16="http://schemas.microsoft.com/office/word/2018/wordml" xmlns:w16sdtdh="http://schemas.microsoft.com/office/word/2020/wordml/sdtdatahash" xmlns:w16sdtfl="http://schemas.microsoft.com/office/word/2024/wordml/sdtformatlock" xmlns:w16se="http://schemas.microsoft.com/office/word/2015/wordml/symex" xmlns:w16du="http://schemas.microsoft.com/office/word/2023/wordml/word16du" mc:Ignorable="w14 w15 w16se w16cid w16 w16cex w16sdtdh w16sdtfl w16du">
   <w:docDefaults>
     <w:rPrDefault>
       <w:rPr>
@@ -15528,7 +15950,7 @@
       </w:pPr>
     </w:pPrDefault>
   </w:docDefaults>
-  <w:latentStyles w:defLockedState="0" w:defUIPriority="99" w:defSemiHidden="0" w:defUnhideWhenUsed="0" w:defQFormat="0" w:count="375">
+  <w:latentStyles w:defLockedState="0" w:defUIPriority="99" w:defSemiHidden="0" w:defUnhideWhenUsed="0" w:defQFormat="0" w:count="376">
     <w:lsdException w:name="Normal" w:uiPriority="0" w:qFormat="1"/>
     <w:lsdException w:name="heading 1" w:uiPriority="9" w:qFormat="1"/>
     <w:lsdException w:name="heading 2" w:semiHidden="1" w:uiPriority="9" w:unhideWhenUsed="1" w:qFormat="1"/>
@@ -15904,6 +16326,7 @@
     <w:lsdException w:name="Smart Hyperlink" w:semiHidden="1" w:unhideWhenUsed="1"/>
     <w:lsdException w:name="Hashtag" w:semiHidden="1" w:unhideWhenUsed="1"/>
     <w:lsdException w:name="Unresolved Mention" w:semiHidden="1" w:unhideWhenUsed="1"/>
+    <w:lsdException w:name="Smart Link" w:semiHidden="1" w:unhideWhenUsed="1"/>
   </w:latentStyles>
   <w:style w:type="paragraph" w:default="1" w:styleId="a">
     <w:name w:val="Normal"/>

</xml_diff>

<commit_message>
feat(rtl): uniform gated-tile SRAM construction + implicit EOP for pool lane sweep
- BERT: payload unified on 2048x34 primitive (new sram_2048x34_tiled with
  per-tile CEN gating); E1/E2-2/E2-3 payload rebuilt from 2048x34 tiles
- LLaMA: config unified on 8192x5 tiled#4 (was native 32768x5 in E2-5/3/2);
  E2-3 payload 3x 4096x34 tiled#4, E2-2 2x 4096x34 tiled#8 (TILES=8 added)
- SD-UNet: already uniform (8192x5#2 + 4096x34 granule); no macro change
- E2-4: implicit EOP via prog_len everywhere; in-band 11111 markers stripped
  from e2 config streams (new rtl/tools/strip_e2_inband_eop_2026_09_16.py);
  cfg totals now match E1/E2-5 (7663/11679/30701)
- dedicated per-pool top + tb for E1 and E2-4 on BERT/SD-UNet/LLaMA
- new fair-sweep regressions: run_{bert,llama,sd_unet}_lane_fair.sh
- all schemes x fwd/rev bit-exact PASS on all three pools
</commit_message>
<xml_diff>
--- a/汇总28nm综合结果.docx
+++ b/汇总28nm综合结果.docx
@@ -10049,6 +10049,7 @@
           <w:bCs/>
         </w:rPr>
       </w:pPr>
+      <w:bookmarkStart w:id="4" w:name="OLE_LINK9"/>
       <w:r>
         <w:rPr>
           <w:b/>
@@ -10791,6 +10792,322 @@
           </w:p>
         </w:tc>
       </w:tr>
+      <w:tr>
+        <w:trPr>
+          <w:trHeight w:val="500"/>
+        </w:trPr>
+        <w:tc>
+          <w:tcPr>
+            <w:tcW w:w="3162" w:type="dxa"/>
+          </w:tcPr>
+          <w:p>
+            <w:pPr>
+              <w:ind w:firstLine="0"/>
+              <w:rPr>
+                <w:color w:val="EE0000"/>
+              </w:rPr>
+            </w:pPr>
+            <w:r>
+              <w:rPr>
+                <w:color w:val="EE0000"/>
+              </w:rPr>
+              <w:t>exp2_three_lane_pool_top_bert</w:t>
+            </w:r>
+          </w:p>
+        </w:tc>
+        <w:tc>
+          <w:tcPr>
+            <w:tcW w:w="1246" w:type="dxa"/>
+          </w:tcPr>
+          <w:p>
+            <w:pPr>
+              <w:ind w:firstLine="0"/>
+              <w:rPr>
+                <w:color w:val="EE0000"/>
+              </w:rPr>
+            </w:pPr>
+            <w:r>
+              <w:rPr>
+                <w:rFonts w:hint="eastAsia"/>
+                <w:color w:val="EE0000"/>
+              </w:rPr>
+              <w:t>TILE</w:t>
+            </w:r>
+            <w:r>
+              <w:rPr>
+                <w:color w:val="EE0000"/>
+              </w:rPr>
+              <w:t>=1</w:t>
+            </w:r>
+            <w:r>
+              <w:rPr>
+                <w:rFonts w:hint="eastAsia"/>
+                <w:color w:val="EE0000"/>
+              </w:rPr>
+              <w:t>，</w:t>
+            </w:r>
+            <w:r>
+              <w:rPr>
+                <w:rFonts w:hint="eastAsia"/>
+                <w:color w:val="EE0000"/>
+              </w:rPr>
+              <w:t>payload</w:t>
+            </w:r>
+            <w:r>
+              <w:rPr>
+                <w:color w:val="EE0000"/>
+              </w:rPr>
+              <w:t xml:space="preserve"> </w:t>
+            </w:r>
+            <w:r>
+              <w:rPr>
+                <w:rFonts w:hint="eastAsia"/>
+                <w:color w:val="EE0000"/>
+              </w:rPr>
+              <w:t>bank</w:t>
+            </w:r>
+            <w:r>
+              <w:rPr>
+                <w:rFonts w:hint="eastAsia"/>
+                <w:color w:val="EE0000"/>
+              </w:rPr>
+              <w:t>深度</w:t>
+            </w:r>
+            <w:r>
+              <w:rPr>
+                <w:color w:val="EE0000"/>
+              </w:rPr>
+              <w:t>4096</w:t>
+            </w:r>
+          </w:p>
+        </w:tc>
+        <w:tc>
+          <w:tcPr>
+            <w:tcW w:w="1565" w:type="dxa"/>
+          </w:tcPr>
+          <w:p>
+            <w:pPr>
+              <w:ind w:firstLine="0"/>
+              <w:rPr>
+                <w:color w:val="EE0000"/>
+              </w:rPr>
+            </w:pPr>
+            <w:r>
+              <w:rPr>
+                <w:rFonts w:hint="eastAsia"/>
+                <w:color w:val="EE0000"/>
+              </w:rPr>
+              <w:t>1</w:t>
+            </w:r>
+            <w:r>
+              <w:rPr>
+                <w:color w:val="EE0000"/>
+              </w:rPr>
+              <w:t>11942</w:t>
+            </w:r>
+          </w:p>
+        </w:tc>
+        <w:tc>
+          <w:tcPr>
+            <w:tcW w:w="1565" w:type="dxa"/>
+          </w:tcPr>
+          <w:p>
+            <w:pPr>
+              <w:ind w:firstLine="0"/>
+              <w:rPr>
+                <w:color w:val="EE0000"/>
+              </w:rPr>
+            </w:pPr>
+            <w:r>
+              <w:rPr>
+                <w:rFonts w:hint="eastAsia"/>
+                <w:color w:val="EE0000"/>
+              </w:rPr>
+              <w:t>5</w:t>
+            </w:r>
+            <w:r>
+              <w:rPr>
+                <w:color w:val="EE0000"/>
+              </w:rPr>
+              <w:t>.725</w:t>
+            </w:r>
+          </w:p>
+        </w:tc>
+        <w:tc>
+          <w:tcPr>
+            <w:tcW w:w="937" w:type="dxa"/>
+          </w:tcPr>
+          <w:p>
+            <w:pPr>
+              <w:ind w:firstLine="0"/>
+              <w:rPr>
+                <w:color w:val="EE0000"/>
+              </w:rPr>
+            </w:pPr>
+            <w:r>
+              <w:rPr>
+                <w:rFonts w:hint="eastAsia"/>
+                <w:color w:val="EE0000"/>
+              </w:rPr>
+              <w:t>0</w:t>
+            </w:r>
+            <w:r>
+              <w:rPr>
+                <w:color w:val="EE0000"/>
+              </w:rPr>
+              <w:t>.0151</w:t>
+            </w:r>
+          </w:p>
+        </w:tc>
+      </w:tr>
+      <w:tr>
+        <w:trPr>
+          <w:trHeight w:val="500"/>
+        </w:trPr>
+        <w:tc>
+          <w:tcPr>
+            <w:tcW w:w="3162" w:type="dxa"/>
+          </w:tcPr>
+          <w:p>
+            <w:pPr>
+              <w:ind w:firstLine="0"/>
+              <w:rPr>
+                <w:color w:val="EE0000"/>
+              </w:rPr>
+            </w:pPr>
+            <w:r>
+              <w:rPr>
+                <w:color w:val="EE0000"/>
+              </w:rPr>
+              <w:t>exp2_t</w:t>
+            </w:r>
+            <w:r>
+              <w:rPr>
+                <w:rFonts w:hint="eastAsia"/>
+                <w:color w:val="EE0000"/>
+              </w:rPr>
+              <w:t>wo</w:t>
+            </w:r>
+            <w:r>
+              <w:rPr>
+                <w:color w:val="EE0000"/>
+              </w:rPr>
+              <w:t>_lane_pool_top_bert</w:t>
+            </w:r>
+          </w:p>
+        </w:tc>
+        <w:tc>
+          <w:tcPr>
+            <w:tcW w:w="1246" w:type="dxa"/>
+          </w:tcPr>
+          <w:p>
+            <w:pPr>
+              <w:ind w:firstLine="0"/>
+              <w:rPr>
+                <w:color w:val="EE0000"/>
+              </w:rPr>
+            </w:pPr>
+            <w:r>
+              <w:rPr>
+                <w:rFonts w:hint="eastAsia"/>
+                <w:color w:val="EE0000"/>
+              </w:rPr>
+              <w:t>bank</w:t>
+            </w:r>
+            <w:r>
+              <w:rPr>
+                <w:rFonts w:hint="eastAsia"/>
+                <w:color w:val="EE0000"/>
+              </w:rPr>
+              <w:t>深度</w:t>
+            </w:r>
+            <w:r>
+              <w:rPr>
+                <w:rFonts w:hint="eastAsia"/>
+                <w:color w:val="EE0000"/>
+              </w:rPr>
+              <w:t>4</w:t>
+            </w:r>
+            <w:r>
+              <w:rPr>
+                <w:color w:val="EE0000"/>
+              </w:rPr>
+              <w:t>096</w:t>
+            </w:r>
+          </w:p>
+        </w:tc>
+        <w:tc>
+          <w:tcPr>
+            <w:tcW w:w="1565" w:type="dxa"/>
+          </w:tcPr>
+          <w:p>
+            <w:pPr>
+              <w:ind w:firstLine="0"/>
+              <w:rPr>
+                <w:color w:val="EE0000"/>
+              </w:rPr>
+            </w:pPr>
+            <w:r>
+              <w:rPr>
+                <w:rFonts w:hint="eastAsia"/>
+                <w:color w:val="EE0000"/>
+              </w:rPr>
+              <w:t>7</w:t>
+            </w:r>
+            <w:r>
+              <w:rPr>
+                <w:color w:val="EE0000"/>
+              </w:rPr>
+              <w:t>9706</w:t>
+            </w:r>
+          </w:p>
+        </w:tc>
+        <w:tc>
+          <w:tcPr>
+            <w:tcW w:w="1565" w:type="dxa"/>
+          </w:tcPr>
+          <w:p>
+            <w:pPr>
+              <w:ind w:firstLine="0"/>
+              <w:rPr>
+                <w:color w:val="EE0000"/>
+              </w:rPr>
+            </w:pPr>
+            <w:r>
+              <w:rPr>
+                <w:rFonts w:hint="eastAsia"/>
+                <w:color w:val="EE0000"/>
+              </w:rPr>
+              <w:t>4</w:t>
+            </w:r>
+            <w:r>
+              <w:rPr>
+                <w:color w:val="EE0000"/>
+              </w:rPr>
+              <w:t>.403</w:t>
+            </w:r>
+          </w:p>
+        </w:tc>
+        <w:tc>
+          <w:tcPr>
+            <w:tcW w:w="937" w:type="dxa"/>
+          </w:tcPr>
+          <w:p>
+            <w:pPr>
+              <w:ind w:firstLine="0"/>
+              <w:rPr>
+                <w:color w:val="EE0000"/>
+              </w:rPr>
+            </w:pPr>
+            <w:r>
+              <w:rPr>
+                <w:color w:val="EE0000"/>
+              </w:rPr>
+              <w:t>0.0145</w:t>
+            </w:r>
+          </w:p>
+        </w:tc>
+      </w:tr>
     </w:tbl>
     <w:p>
       <w:pPr>
@@ -10800,6 +11117,8 @@
           <w:bCs/>
         </w:rPr>
       </w:pPr>
+      <w:bookmarkStart w:id="5" w:name="OLE_LINK14"/>
+      <w:bookmarkEnd w:id="4"/>
       <w:proofErr w:type="spellStart"/>
       <w:r>
         <w:rPr>
@@ -10841,12 +11160,13 @@
     <w:tbl>
       <w:tblPr>
         <w:tblStyle w:val="a5"/>
-        <w:tblW w:w="8607" w:type="dxa"/>
+        <w:tblW w:w="8443" w:type="dxa"/>
+        <w:tblLayout w:type="fixed"/>
         <w:tblLook w:val="04A0" w:firstRow="1" w:lastRow="0" w:firstColumn="1" w:lastColumn="0" w:noHBand="0" w:noVBand="1"/>
       </w:tblPr>
       <w:tblGrid>
-        <w:gridCol w:w="3322"/>
-        <w:gridCol w:w="1232"/>
+        <w:gridCol w:w="3114"/>
+        <w:gridCol w:w="1276"/>
         <w:gridCol w:w="1565"/>
         <w:gridCol w:w="1565"/>
         <w:gridCol w:w="923"/>
@@ -10857,7 +11177,7 @@
         </w:trPr>
         <w:tc>
           <w:tcPr>
-            <w:tcW w:w="3322" w:type="dxa"/>
+            <w:tcW w:w="3114" w:type="dxa"/>
           </w:tcPr>
           <w:p>
             <w:pPr>
@@ -10873,7 +11193,7 @@
         </w:tc>
         <w:tc>
           <w:tcPr>
-            <w:tcW w:w="1232" w:type="dxa"/>
+            <w:tcW w:w="1276" w:type="dxa"/>
           </w:tcPr>
           <w:p>
             <w:pPr>
@@ -11002,7 +11322,7 @@
         </w:trPr>
         <w:tc>
           <w:tcPr>
-            <w:tcW w:w="3322" w:type="dxa"/>
+            <w:tcW w:w="3114" w:type="dxa"/>
           </w:tcPr>
           <w:p>
             <w:pPr>
@@ -11033,7 +11353,7 @@
         </w:tc>
         <w:tc>
           <w:tcPr>
-            <w:tcW w:w="1232" w:type="dxa"/>
+            <w:tcW w:w="1276" w:type="dxa"/>
           </w:tcPr>
           <w:p>
             <w:pPr>
@@ -11102,7 +11422,7 @@
         </w:trPr>
         <w:tc>
           <w:tcPr>
-            <w:tcW w:w="3322" w:type="dxa"/>
+            <w:tcW w:w="3114" w:type="dxa"/>
           </w:tcPr>
           <w:p>
             <w:pPr>
@@ -11130,7 +11450,7 @@
         </w:tc>
         <w:tc>
           <w:tcPr>
-            <w:tcW w:w="1232" w:type="dxa"/>
+            <w:tcW w:w="1276" w:type="dxa"/>
           </w:tcPr>
           <w:p>
             <w:pPr>
@@ -11211,7 +11531,7 @@
         </w:trPr>
         <w:tc>
           <w:tcPr>
-            <w:tcW w:w="3322" w:type="dxa"/>
+            <w:tcW w:w="3114" w:type="dxa"/>
           </w:tcPr>
           <w:p>
             <w:pPr>
@@ -11224,7 +11544,7 @@
         </w:tc>
         <w:tc>
           <w:tcPr>
-            <w:tcW w:w="1232" w:type="dxa"/>
+            <w:tcW w:w="1276" w:type="dxa"/>
           </w:tcPr>
           <w:p>
             <w:pPr>
@@ -11341,7 +11661,7 @@
         </w:trPr>
         <w:tc>
           <w:tcPr>
-            <w:tcW w:w="3322" w:type="dxa"/>
+            <w:tcW w:w="3114" w:type="dxa"/>
           </w:tcPr>
           <w:p>
             <w:pPr>
@@ -11361,7 +11681,7 @@
         </w:tc>
         <w:tc>
           <w:tcPr>
-            <w:tcW w:w="1232" w:type="dxa"/>
+            <w:tcW w:w="1276" w:type="dxa"/>
           </w:tcPr>
           <w:p>
             <w:pPr>
@@ -11461,11 +11781,330 @@
                 <w:color w:val="EE0000"/>
               </w:rPr>
               <w:t>.0187</w:t>
+            </w:r>
+          </w:p>
+        </w:tc>
+      </w:tr>
+      <w:tr>
+        <w:trPr>
+          <w:trHeight w:val="500"/>
+        </w:trPr>
+        <w:tc>
+          <w:tcPr>
+            <w:tcW w:w="3114" w:type="dxa"/>
+          </w:tcPr>
+          <w:p>
+            <w:pPr>
+              <w:ind w:firstLine="0"/>
+              <w:rPr>
+                <w:color w:val="EE0000"/>
+              </w:rPr>
+            </w:pPr>
+            <w:r>
+              <w:rPr>
+                <w:color w:val="EE0000"/>
+              </w:rPr>
+              <w:t>exp2_three_lane_pool_top_llama</w:t>
+            </w:r>
+          </w:p>
+        </w:tc>
+        <w:tc>
+          <w:tcPr>
+            <w:tcW w:w="1276" w:type="dxa"/>
+          </w:tcPr>
+          <w:p>
+            <w:pPr>
+              <w:ind w:firstLine="0"/>
+              <w:rPr>
+                <w:color w:val="EE0000"/>
+              </w:rPr>
+            </w:pPr>
+            <w:r>
+              <w:rPr>
+                <w:rFonts w:hint="eastAsia"/>
+              </w:rPr>
+              <w:t>payload</w:t>
+            </w:r>
+            <w:r>
+              <w:t xml:space="preserve"> </w:t>
+            </w:r>
+            <w:r>
+              <w:rPr>
+                <w:rFonts w:hint="eastAsia"/>
+              </w:rPr>
+              <w:t>bank</w:t>
+            </w:r>
+            <w:r>
+              <w:rPr>
+                <w:rFonts w:hint="eastAsia"/>
+              </w:rPr>
+              <w:t>深度</w:t>
+            </w:r>
+            <w:r>
+              <w:rPr>
+                <w:rFonts w:hint="eastAsia"/>
+              </w:rPr>
+              <w:t>1</w:t>
+            </w:r>
+            <w:r>
+              <w:t>6384</w:t>
+            </w:r>
+          </w:p>
+        </w:tc>
+        <w:tc>
+          <w:tcPr>
+            <w:tcW w:w="1565" w:type="dxa"/>
+          </w:tcPr>
+          <w:p>
+            <w:pPr>
+              <w:ind w:firstLine="0"/>
+              <w:rPr>
+                <w:color w:val="EE0000"/>
+              </w:rPr>
+            </w:pPr>
+            <w:r>
+              <w:rPr>
+                <w:rFonts w:hint="eastAsia"/>
+                <w:color w:val="EE0000"/>
+              </w:rPr>
+              <w:t>3</w:t>
+            </w:r>
+            <w:r>
+              <w:rPr>
+                <w:color w:val="EE0000"/>
+              </w:rPr>
+              <w:t>93287</w:t>
+            </w:r>
+          </w:p>
+        </w:tc>
+        <w:tc>
+          <w:tcPr>
+            <w:tcW w:w="1565" w:type="dxa"/>
+          </w:tcPr>
+          <w:p>
+            <w:pPr>
+              <w:ind w:firstLine="0"/>
+              <w:rPr>
+                <w:color w:val="EE0000"/>
+              </w:rPr>
+            </w:pPr>
+            <w:r>
+              <w:rPr>
+                <w:rFonts w:hint="eastAsia"/>
+                <w:color w:val="EE0000"/>
+              </w:rPr>
+              <w:t>8</w:t>
+            </w:r>
+            <w:r>
+              <w:rPr>
+                <w:color w:val="EE0000"/>
+              </w:rPr>
+              <w:t>.062</w:t>
+            </w:r>
+          </w:p>
+        </w:tc>
+        <w:tc>
+          <w:tcPr>
+            <w:tcW w:w="923" w:type="dxa"/>
+          </w:tcPr>
+          <w:p>
+            <w:pPr>
+              <w:ind w:firstLine="0"/>
+              <w:rPr>
+                <w:color w:val="EE0000"/>
+              </w:rPr>
+            </w:pPr>
+            <w:r>
+              <w:rPr>
+                <w:rFonts w:hint="eastAsia"/>
+                <w:color w:val="EE0000"/>
+              </w:rPr>
+              <w:t>0</w:t>
+            </w:r>
+            <w:r>
+              <w:rPr>
+                <w:color w:val="EE0000"/>
+              </w:rPr>
+              <w:t>.0247</w:t>
+            </w:r>
+          </w:p>
+        </w:tc>
+      </w:tr>
+      <w:tr>
+        <w:trPr>
+          <w:trHeight w:val="500"/>
+        </w:trPr>
+        <w:tc>
+          <w:tcPr>
+            <w:tcW w:w="3114" w:type="dxa"/>
+          </w:tcPr>
+          <w:p>
+            <w:pPr>
+              <w:ind w:firstLine="0"/>
+              <w:rPr>
+                <w:color w:val="EE0000"/>
+              </w:rPr>
+            </w:pPr>
+            <w:r>
+              <w:rPr>
+                <w:color w:val="EE0000"/>
+              </w:rPr>
+              <w:t>exp2_t</w:t>
+            </w:r>
+            <w:r>
+              <w:rPr>
+                <w:rFonts w:hint="eastAsia"/>
+                <w:color w:val="EE0000"/>
+              </w:rPr>
+              <w:t>wo</w:t>
+            </w:r>
+            <w:r>
+              <w:rPr>
+                <w:color w:val="EE0000"/>
+              </w:rPr>
+              <w:t>_lane_pool_top_llama</w:t>
+            </w:r>
+          </w:p>
+        </w:tc>
+        <w:tc>
+          <w:tcPr>
+            <w:tcW w:w="1276" w:type="dxa"/>
+          </w:tcPr>
+          <w:p>
+            <w:pPr>
+              <w:ind w:firstLine="0"/>
+            </w:pPr>
+            <w:r>
+              <w:rPr>
+                <w:rFonts w:hint="eastAsia"/>
+              </w:rPr>
+              <w:t>config</w:t>
+            </w:r>
+            <w:r>
+              <w:rPr>
+                <w:rFonts w:hint="eastAsia"/>
+              </w:rPr>
+              <w:t>深度</w:t>
+            </w:r>
+            <w:r>
+              <w:rPr>
+                <w:rFonts w:hint="eastAsia"/>
+              </w:rPr>
+              <w:t>3</w:t>
+            </w:r>
+            <w:r>
+              <w:t>2768</w:t>
+            </w:r>
+            <w:r>
+              <w:rPr>
+                <w:rFonts w:hint="eastAsia"/>
+              </w:rPr>
+              <w:t>，</w:t>
+            </w:r>
+            <w:r>
+              <w:rPr>
+                <w:rFonts w:hint="eastAsia"/>
+              </w:rPr>
+              <w:t>payload</w:t>
+            </w:r>
+            <w:r>
+              <w:rPr>
+                <w:rFonts w:hint="eastAsia"/>
+              </w:rPr>
+              <w:t>深度</w:t>
+            </w:r>
+            <w:r>
+              <w:rPr>
+                <w:rFonts w:hint="eastAsia"/>
+              </w:rPr>
+              <w:t>3</w:t>
+            </w:r>
+            <w:r>
+              <w:t>2768</w:t>
+            </w:r>
+          </w:p>
+        </w:tc>
+        <w:tc>
+          <w:tcPr>
+            <w:tcW w:w="1565" w:type="dxa"/>
+          </w:tcPr>
+          <w:p>
+            <w:pPr>
+              <w:ind w:firstLine="0"/>
+              <w:rPr>
+                <w:color w:val="EE0000"/>
+              </w:rPr>
+            </w:pPr>
+            <w:r>
+              <w:rPr>
+                <w:rFonts w:hint="eastAsia"/>
+                <w:color w:val="EE0000"/>
+              </w:rPr>
+              <w:t>5</w:t>
+            </w:r>
+            <w:r>
+              <w:rPr>
+                <w:color w:val="EE0000"/>
+              </w:rPr>
+              <w:t>09450</w:t>
+            </w:r>
+          </w:p>
+        </w:tc>
+        <w:tc>
+          <w:tcPr>
+            <w:tcW w:w="1565" w:type="dxa"/>
+          </w:tcPr>
+          <w:p>
+            <w:pPr>
+              <w:ind w:firstLine="0"/>
+              <w:rPr>
+                <w:color w:val="EE0000"/>
+              </w:rPr>
+            </w:pPr>
+            <w:r>
+              <w:rPr>
+                <w:rFonts w:hint="eastAsia"/>
+                <w:color w:val="EE0000"/>
+              </w:rPr>
+              <w:t>6</w:t>
+            </w:r>
+            <w:r>
+              <w:rPr>
+                <w:color w:val="EE0000"/>
+              </w:rPr>
+              <w:t>.710</w:t>
+            </w:r>
+          </w:p>
+        </w:tc>
+        <w:tc>
+          <w:tcPr>
+            <w:tcW w:w="923" w:type="dxa"/>
+          </w:tcPr>
+          <w:p>
+            <w:pPr>
+              <w:ind w:firstLine="0"/>
+              <w:rPr>
+                <w:color w:val="EE0000"/>
+              </w:rPr>
+            </w:pPr>
+            <w:r>
+              <w:rPr>
+                <w:rFonts w:hint="eastAsia"/>
+                <w:color w:val="EE0000"/>
+              </w:rPr>
+              <w:t>0</w:t>
+            </w:r>
+            <w:r>
+              <w:rPr>
+                <w:color w:val="EE0000"/>
+              </w:rPr>
+              <w:t>.0246</w:t>
             </w:r>
           </w:p>
         </w:tc>
       </w:tr>
     </w:tbl>
+    <w:bookmarkEnd w:id="5"/>
     <w:p>
       <w:pPr>
         <w:ind w:firstLine="0"/>
@@ -11507,6 +12146,7 @@
           <w:rFonts w:hint="eastAsia"/>
           <w:bCs/>
         </w:rPr>
+        <w:lastRenderedPageBreak/>
         <w:t xml:space="preserve">  </w:t>
       </w:r>
       <w:r>
@@ -11908,7 +12548,6 @@
           <w:rFonts w:hint="eastAsia"/>
           <w:bCs/>
         </w:rPr>
-        <w:lastRenderedPageBreak/>
         <w:t xml:space="preserve">  - u_lane0..4: 5 </w:t>
       </w:r>
       <w:r>
@@ -12374,6 +13013,7 @@
           <w:bCs/>
         </w:rPr>
       </w:pPr>
+      <w:bookmarkStart w:id="6" w:name="OLE_LINK16"/>
     </w:p>
     <w:p>
       <w:pPr>
@@ -12806,6 +13446,7 @@
               <w:ind w:firstLine="0"/>
             </w:pPr>
             <w:r>
+              <w:lastRenderedPageBreak/>
               <w:t>exp2_five_lane_pool_top_sd_unet</w:t>
             </w:r>
           </w:p>
@@ -13090,6 +13731,359 @@
           </w:p>
         </w:tc>
       </w:tr>
+      <w:tr>
+        <w:trPr>
+          <w:trHeight w:val="500"/>
+        </w:trPr>
+        <w:tc>
+          <w:tcPr>
+            <w:tcW w:w="3256" w:type="dxa"/>
+          </w:tcPr>
+          <w:p>
+            <w:pPr>
+              <w:ind w:firstLine="0"/>
+              <w:rPr>
+                <w:color w:val="EE0000"/>
+              </w:rPr>
+            </w:pPr>
+            <w:r>
+              <w:t>exp2_</w:t>
+            </w:r>
+            <w:r>
+              <w:rPr>
+                <w:rFonts w:hint="eastAsia"/>
+              </w:rPr>
+              <w:t>three</w:t>
+            </w:r>
+            <w:r>
+              <w:t>_lane_pool_top_sd_unet</w:t>
+            </w:r>
+          </w:p>
+        </w:tc>
+        <w:tc>
+          <w:tcPr>
+            <w:tcW w:w="1272" w:type="dxa"/>
+          </w:tcPr>
+          <w:p>
+            <w:pPr>
+              <w:ind w:firstLine="0"/>
+              <w:rPr>
+                <w:color w:val="EE0000"/>
+              </w:rPr>
+            </w:pPr>
+            <w:r>
+              <w:rPr>
+                <w:rFonts w:hint="eastAsia"/>
+                <w:color w:val="EE0000"/>
+              </w:rPr>
+              <w:t>config</w:t>
+            </w:r>
+            <w:r>
+              <w:rPr>
+                <w:rFonts w:hint="eastAsia"/>
+                <w:color w:val="EE0000"/>
+              </w:rPr>
+              <w:t>深</w:t>
+            </w:r>
+            <w:r>
+              <w:rPr>
+                <w:rFonts w:hint="eastAsia"/>
+                <w:color w:val="EE0000"/>
+              </w:rPr>
+              <w:t>1</w:t>
+            </w:r>
+            <w:r>
+              <w:rPr>
+                <w:color w:val="EE0000"/>
+              </w:rPr>
+              <w:t>6384</w:t>
+            </w:r>
+            <w:r>
+              <w:rPr>
+                <w:rFonts w:hint="eastAsia"/>
+                <w:color w:val="EE0000"/>
+              </w:rPr>
+              <w:t>，</w:t>
+            </w:r>
+            <w:r>
+              <w:rPr>
+                <w:rFonts w:hint="eastAsia"/>
+                <w:color w:val="EE0000"/>
+              </w:rPr>
+              <w:t>payload</w:t>
+            </w:r>
+            <w:r>
+              <w:rPr>
+                <w:rFonts w:hint="eastAsia"/>
+                <w:color w:val="EE0000"/>
+              </w:rPr>
+              <w:t>深</w:t>
+            </w:r>
+            <w:r>
+              <w:rPr>
+                <w:rFonts w:hint="eastAsia"/>
+                <w:color w:val="EE0000"/>
+              </w:rPr>
+              <w:t>8</w:t>
+            </w:r>
+            <w:r>
+              <w:rPr>
+                <w:color w:val="EE0000"/>
+              </w:rPr>
+              <w:t>192</w:t>
+            </w:r>
+          </w:p>
+        </w:tc>
+        <w:tc>
+          <w:tcPr>
+            <w:tcW w:w="1565" w:type="dxa"/>
+          </w:tcPr>
+          <w:p>
+            <w:pPr>
+              <w:ind w:firstLine="0"/>
+              <w:rPr>
+                <w:color w:val="EE0000"/>
+              </w:rPr>
+            </w:pPr>
+            <w:r>
+              <w:rPr>
+                <w:rFonts w:hint="eastAsia"/>
+                <w:color w:val="EE0000"/>
+              </w:rPr>
+              <w:t>2</w:t>
+            </w:r>
+            <w:r>
+              <w:rPr>
+                <w:color w:val="EE0000"/>
+              </w:rPr>
+              <w:t>22756</w:t>
+            </w:r>
+          </w:p>
+        </w:tc>
+        <w:tc>
+          <w:tcPr>
+            <w:tcW w:w="1565" w:type="dxa"/>
+          </w:tcPr>
+          <w:p>
+            <w:pPr>
+              <w:ind w:firstLine="0"/>
+              <w:rPr>
+                <w:color w:val="EE0000"/>
+              </w:rPr>
+            </w:pPr>
+            <w:r>
+              <w:rPr>
+                <w:rFonts w:hint="eastAsia"/>
+                <w:color w:val="EE0000"/>
+              </w:rPr>
+              <w:t>6</w:t>
+            </w:r>
+            <w:r>
+              <w:rPr>
+                <w:color w:val="EE0000"/>
+              </w:rPr>
+              <w:t>.660</w:t>
+            </w:r>
+          </w:p>
+        </w:tc>
+        <w:tc>
+          <w:tcPr>
+            <w:tcW w:w="923" w:type="dxa"/>
+          </w:tcPr>
+          <w:p>
+            <w:pPr>
+              <w:ind w:firstLine="0"/>
+              <w:rPr>
+                <w:color w:val="EE0000"/>
+              </w:rPr>
+            </w:pPr>
+            <w:r>
+              <w:rPr>
+                <w:rFonts w:hint="eastAsia"/>
+                <w:color w:val="EE0000"/>
+              </w:rPr>
+              <w:t>0</w:t>
+            </w:r>
+            <w:r>
+              <w:rPr>
+                <w:color w:val="EE0000"/>
+              </w:rPr>
+              <w:t>.0179</w:t>
+            </w:r>
+          </w:p>
+        </w:tc>
+      </w:tr>
+      <w:tr>
+        <w:trPr>
+          <w:trHeight w:val="500"/>
+        </w:trPr>
+        <w:tc>
+          <w:tcPr>
+            <w:tcW w:w="3256" w:type="dxa"/>
+          </w:tcPr>
+          <w:p>
+            <w:pPr>
+              <w:ind w:firstLine="0"/>
+            </w:pPr>
+            <w:r>
+              <w:t>exp2_two_lane_pool_top_sd_unet</w:t>
+            </w:r>
+          </w:p>
+        </w:tc>
+        <w:tc>
+          <w:tcPr>
+            <w:tcW w:w="1272" w:type="dxa"/>
+          </w:tcPr>
+          <w:p>
+            <w:pPr>
+              <w:ind w:firstLine="0"/>
+              <w:rPr>
+                <w:color w:val="EE0000"/>
+              </w:rPr>
+            </w:pPr>
+            <w:r>
+              <w:rPr>
+                <w:rFonts w:hint="eastAsia"/>
+                <w:color w:val="EE0000"/>
+              </w:rPr>
+              <w:t>config</w:t>
+            </w:r>
+            <w:r>
+              <w:rPr>
+                <w:rFonts w:hint="eastAsia"/>
+                <w:color w:val="EE0000"/>
+              </w:rPr>
+              <w:t>深</w:t>
+            </w:r>
+            <w:r>
+              <w:rPr>
+                <w:rFonts w:hint="eastAsia"/>
+                <w:color w:val="EE0000"/>
+              </w:rPr>
+              <w:t>1</w:t>
+            </w:r>
+            <w:r>
+              <w:rPr>
+                <w:color w:val="EE0000"/>
+              </w:rPr>
+              <w:t>6384</w:t>
+            </w:r>
+            <w:r>
+              <w:rPr>
+                <w:rFonts w:hint="eastAsia"/>
+                <w:color w:val="EE0000"/>
+              </w:rPr>
+              <w:t>，</w:t>
+            </w:r>
+            <w:r>
+              <w:rPr>
+                <w:rFonts w:hint="eastAsia"/>
+                <w:color w:val="EE0000"/>
+              </w:rPr>
+              <w:t>payload</w:t>
+            </w:r>
+            <w:r>
+              <w:rPr>
+                <w:rFonts w:hint="eastAsia"/>
+                <w:color w:val="EE0000"/>
+              </w:rPr>
+              <w:t>深</w:t>
+            </w:r>
+            <w:r>
+              <w:rPr>
+                <w:rFonts w:hint="eastAsia"/>
+                <w:color w:val="EE0000"/>
+              </w:rPr>
+              <w:t>8</w:t>
+            </w:r>
+            <w:r>
+              <w:rPr>
+                <w:color w:val="EE0000"/>
+              </w:rPr>
+              <w:t>192</w:t>
+            </w:r>
+          </w:p>
+        </w:tc>
+        <w:tc>
+          <w:tcPr>
+            <w:tcW w:w="1565" w:type="dxa"/>
+          </w:tcPr>
+          <w:p>
+            <w:pPr>
+              <w:ind w:firstLine="0"/>
+              <w:rPr>
+                <w:color w:val="EE0000"/>
+              </w:rPr>
+            </w:pPr>
+            <w:r>
+              <w:rPr>
+                <w:rFonts w:hint="eastAsia"/>
+                <w:color w:val="EE0000"/>
+              </w:rPr>
+              <w:t>1</w:t>
+            </w:r>
+            <w:r>
+              <w:rPr>
+                <w:color w:val="EE0000"/>
+              </w:rPr>
+              <w:t>58378</w:t>
+            </w:r>
+          </w:p>
+        </w:tc>
+        <w:tc>
+          <w:tcPr>
+            <w:tcW w:w="1565" w:type="dxa"/>
+          </w:tcPr>
+          <w:p>
+            <w:pPr>
+              <w:ind w:firstLine="0"/>
+              <w:rPr>
+                <w:color w:val="EE0000"/>
+              </w:rPr>
+            </w:pPr>
+            <w:r>
+              <w:rPr>
+                <w:rFonts w:hint="eastAsia"/>
+                <w:color w:val="EE0000"/>
+              </w:rPr>
+              <w:t>5</w:t>
+            </w:r>
+            <w:r>
+              <w:rPr>
+                <w:color w:val="EE0000"/>
+              </w:rPr>
+              <w:t>.126</w:t>
+            </w:r>
+          </w:p>
+        </w:tc>
+        <w:tc>
+          <w:tcPr>
+            <w:tcW w:w="923" w:type="dxa"/>
+          </w:tcPr>
+          <w:p>
+            <w:pPr>
+              <w:ind w:firstLine="0"/>
+              <w:rPr>
+                <w:color w:val="EE0000"/>
+              </w:rPr>
+            </w:pPr>
+            <w:r>
+              <w:rPr>
+                <w:rFonts w:hint="eastAsia"/>
+                <w:color w:val="EE0000"/>
+              </w:rPr>
+              <w:t>0</w:t>
+            </w:r>
+            <w:r>
+              <w:rPr>
+                <w:color w:val="EE0000"/>
+              </w:rPr>
+              <w:t>.0175</w:t>
+            </w:r>
+          </w:p>
+        </w:tc>
+      </w:tr>
+      <w:bookmarkEnd w:id="6"/>
     </w:tbl>
     <w:p>
       <w:pPr>
@@ -13105,7 +14099,7 @@
       <w:pPr>
         <w:ind w:firstLine="0"/>
       </w:pPr>
-      <w:bookmarkStart w:id="4" w:name="OLE_LINK6"/>
+      <w:bookmarkStart w:id="7" w:name="OLE_LINK6"/>
       <w:r>
         <w:rPr>
           <w:rFonts w:hint="eastAsia"/>
@@ -13133,7 +14127,6 @@
         <w:rPr>
           <w:rFonts w:hint="eastAsia"/>
         </w:rPr>
-        <w:lastRenderedPageBreak/>
         <w:t>阅读</w:t>
       </w:r>
       <w:r>
@@ -13383,7 +14376,7 @@
         </w:rPr>
         <w:t>请帮我探索这个方案。探索过程的实验基准采用最新的</w:t>
       </w:r>
-      <w:bookmarkStart w:id="5" w:name="OLE_LINK8"/>
+      <w:bookmarkStart w:id="8" w:name="OLE_LINK8"/>
       <w:r>
         <w:rPr>
           <w:rStyle w:val="ui-markdowninline-path-prefix"/>
@@ -13417,7 +14410,7 @@
         </w:rPr>
         <w:t>个程序池的实验测例</w:t>
       </w:r>
-      <w:bookmarkEnd w:id="5"/>
+      <w:bookmarkEnd w:id="8"/>
       <w:r>
         <w:rPr>
           <w:rStyle w:val="ui-markdowninline-path-filename"/>
@@ -13468,7 +14461,7 @@
         <w:t>个程序池的结果分别总结出来。</w:t>
       </w:r>
     </w:p>
-    <w:bookmarkEnd w:id="4"/>
+    <w:bookmarkEnd w:id="7"/>
     <w:p>
       <w:pPr>
         <w:pStyle w:val="a4"/>
@@ -13491,6 +14484,7 @@
       <w:pPr>
         <w:pStyle w:val="2"/>
       </w:pPr>
+      <w:bookmarkStart w:id="9" w:name="OLE_LINK13"/>
       <w:r>
         <w:t>三程序池周期数</w:t>
       </w:r>
@@ -14070,12 +15064,530 @@
         <w:pStyle w:val="a4"/>
         <w:jc w:val="both"/>
       </w:pPr>
+      <w:r>
+        <w:rPr>
+          <w:rFonts w:hint="eastAsia"/>
+        </w:rPr>
+        <w:t>解码部分电路面积</w:t>
+      </w:r>
+      <w:r>
+        <w:rPr>
+          <w:rFonts w:hint="eastAsia"/>
+        </w:rPr>
+        <w:t>（单位平方微米）</w:t>
+      </w:r>
+      <w:r>
+        <w:rPr>
+          <w:rFonts w:hint="eastAsia"/>
+        </w:rPr>
+        <w:t>：</w:t>
+      </w:r>
+    </w:p>
+    <w:tbl>
+      <w:tblPr>
+        <w:tblStyle w:val="a5"/>
+        <w:tblW w:w="0" w:type="auto"/>
+        <w:tblLook w:val="04A0" w:firstRow="1" w:lastRow="0" w:firstColumn="1" w:lastColumn="0" w:noHBand="0" w:noVBand="1"/>
+      </w:tblPr>
+      <w:tblGrid>
+        <w:gridCol w:w="1068"/>
+        <w:gridCol w:w="1807"/>
+        <w:gridCol w:w="1807"/>
+        <w:gridCol w:w="1807"/>
+        <w:gridCol w:w="1807"/>
+      </w:tblGrid>
+      <w:tr>
+        <w:tc>
+          <w:tcPr>
+            <w:tcW w:w="0" w:type="auto"/>
+            <w:noWrap/>
+            <w:hideMark/>
+          </w:tcPr>
+          <w:p>
+            <w:pPr>
+              <w:rPr>
+                <w:rFonts w:ascii="宋体" w:hAnsi="宋体" w:cs="宋体"/>
+                <w:b/>
+                <w:bCs/>
+                <w:szCs w:val="24"/>
+              </w:rPr>
+            </w:pPr>
+            <w:r>
+              <w:rPr>
+                <w:b/>
+                <w:bCs/>
+              </w:rPr>
+              <w:t>程序池</w:t>
+            </w:r>
+          </w:p>
+        </w:tc>
+        <w:tc>
+          <w:tcPr>
+            <w:tcW w:w="0" w:type="auto"/>
+            <w:noWrap/>
+            <w:hideMark/>
+          </w:tcPr>
+          <w:p>
+            <w:pPr>
+              <w:jc w:val="right"/>
+              <w:rPr>
+                <w:b/>
+                <w:bCs/>
+              </w:rPr>
+            </w:pPr>
+            <w:r>
+              <w:rPr>
+                <w:b/>
+                <w:bCs/>
+              </w:rPr>
+              <w:t>lane=5</w:t>
+            </w:r>
+            <w:r>
+              <w:rPr>
+                <w:b/>
+                <w:bCs/>
+              </w:rPr>
+              <w:t>（</w:t>
+            </w:r>
+            <w:r>
+              <w:rPr>
+                <w:b/>
+                <w:bCs/>
+              </w:rPr>
+              <w:t>max-5</w:t>
+            </w:r>
+            <w:r>
+              <w:rPr>
+                <w:b/>
+                <w:bCs/>
+              </w:rPr>
+              <w:t>）</w:t>
+            </w:r>
+          </w:p>
+        </w:tc>
+        <w:tc>
+          <w:tcPr>
+            <w:tcW w:w="0" w:type="auto"/>
+            <w:noWrap/>
+            <w:hideMark/>
+          </w:tcPr>
+          <w:p>
+            <w:pPr>
+              <w:jc w:val="right"/>
+              <w:rPr>
+                <w:b/>
+                <w:bCs/>
+              </w:rPr>
+            </w:pPr>
+            <w:r>
+              <w:rPr>
+                <w:b/>
+                <w:bCs/>
+              </w:rPr>
+              <w:t>lane=4</w:t>
+            </w:r>
+            <w:r>
+              <w:rPr>
+                <w:b/>
+                <w:bCs/>
+              </w:rPr>
+              <w:t>（</w:t>
+            </w:r>
+            <w:r>
+              <w:rPr>
+                <w:b/>
+                <w:bCs/>
+              </w:rPr>
+              <w:t>max-4</w:t>
+            </w:r>
+            <w:r>
+              <w:rPr>
+                <w:b/>
+                <w:bCs/>
+              </w:rPr>
+              <w:t>）</w:t>
+            </w:r>
+          </w:p>
+        </w:tc>
+        <w:tc>
+          <w:tcPr>
+            <w:tcW w:w="0" w:type="auto"/>
+            <w:noWrap/>
+            <w:hideMark/>
+          </w:tcPr>
+          <w:p>
+            <w:pPr>
+              <w:jc w:val="right"/>
+              <w:rPr>
+                <w:b/>
+                <w:bCs/>
+              </w:rPr>
+            </w:pPr>
+            <w:r>
+              <w:rPr>
+                <w:b/>
+                <w:bCs/>
+              </w:rPr>
+              <w:t>lane=3</w:t>
+            </w:r>
+            <w:r>
+              <w:rPr>
+                <w:b/>
+                <w:bCs/>
+              </w:rPr>
+              <w:t>（</w:t>
+            </w:r>
+            <w:r>
+              <w:rPr>
+                <w:b/>
+                <w:bCs/>
+              </w:rPr>
+              <w:t>max-3</w:t>
+            </w:r>
+            <w:r>
+              <w:rPr>
+                <w:b/>
+                <w:bCs/>
+              </w:rPr>
+              <w:t>）</w:t>
+            </w:r>
+          </w:p>
+        </w:tc>
+        <w:tc>
+          <w:tcPr>
+            <w:tcW w:w="0" w:type="auto"/>
+            <w:noWrap/>
+            <w:hideMark/>
+          </w:tcPr>
+          <w:p>
+            <w:pPr>
+              <w:jc w:val="right"/>
+              <w:rPr>
+                <w:b/>
+                <w:bCs/>
+              </w:rPr>
+            </w:pPr>
+            <w:r>
+              <w:rPr>
+                <w:b/>
+                <w:bCs/>
+              </w:rPr>
+              <w:t>lane=2</w:t>
+            </w:r>
+            <w:r>
+              <w:rPr>
+                <w:b/>
+                <w:bCs/>
+              </w:rPr>
+              <w:t>（</w:t>
+            </w:r>
+            <w:r>
+              <w:rPr>
+                <w:b/>
+                <w:bCs/>
+              </w:rPr>
+              <w:t>max-2</w:t>
+            </w:r>
+            <w:r>
+              <w:rPr>
+                <w:b/>
+                <w:bCs/>
+              </w:rPr>
+              <w:t>）</w:t>
+            </w:r>
+          </w:p>
+        </w:tc>
+      </w:tr>
+      <w:tr>
+        <w:tc>
+          <w:tcPr>
+            <w:tcW w:w="0" w:type="auto"/>
+            <w:hideMark/>
+          </w:tcPr>
+          <w:p>
+            <w:pPr>
+              <w:jc w:val="left"/>
+            </w:pPr>
+            <w:r>
+              <w:t>BERT</w:t>
+            </w:r>
+            <w:r>
+              <w:t>（</w:t>
+            </w:r>
+            <w:r>
+              <w:t xml:space="preserve">4 </w:t>
+            </w:r>
+            <w:r>
+              <w:t>程序）</w:t>
+            </w:r>
+          </w:p>
+        </w:tc>
+        <w:tc>
+          <w:tcPr>
+            <w:tcW w:w="0" w:type="auto"/>
+            <w:hideMark/>
+          </w:tcPr>
+          <w:p>
+            <w:pPr>
+              <w:jc w:val="right"/>
+            </w:pPr>
+          </w:p>
+        </w:tc>
+        <w:tc>
+          <w:tcPr>
+            <w:tcW w:w="0" w:type="auto"/>
+            <w:hideMark/>
+          </w:tcPr>
+          <w:p>
+            <w:pPr>
+              <w:jc w:val="right"/>
+            </w:pPr>
+          </w:p>
+        </w:tc>
+        <w:tc>
+          <w:tcPr>
+            <w:tcW w:w="0" w:type="auto"/>
+            <w:hideMark/>
+          </w:tcPr>
+          <w:p>
+            <w:pPr>
+              <w:jc w:val="right"/>
+            </w:pPr>
+            <w:r>
+              <w:rPr>
+                <w:rFonts w:hint="eastAsia"/>
+              </w:rPr>
+              <w:t>1</w:t>
+            </w:r>
+            <w:r>
+              <w:t>268</w:t>
+            </w:r>
+          </w:p>
+        </w:tc>
+        <w:tc>
+          <w:tcPr>
+            <w:tcW w:w="0" w:type="auto"/>
+            <w:hideMark/>
+          </w:tcPr>
+          <w:p>
+            <w:pPr>
+              <w:jc w:val="right"/>
+            </w:pPr>
+            <w:r>
+              <w:rPr>
+                <w:rFonts w:hint="eastAsia"/>
+              </w:rPr>
+              <w:t>1</w:t>
+            </w:r>
+            <w:r>
+              <w:t>108</w:t>
+            </w:r>
+          </w:p>
+        </w:tc>
+      </w:tr>
+      <w:tr>
+        <w:tc>
+          <w:tcPr>
+            <w:tcW w:w="0" w:type="auto"/>
+            <w:hideMark/>
+          </w:tcPr>
+          <w:p>
+            <w:pPr>
+              <w:jc w:val="left"/>
+            </w:pPr>
+            <w:r>
+              <w:t>SD-</w:t>
+            </w:r>
+            <w:proofErr w:type="spellStart"/>
+            <w:r>
+              <w:t>UNet</w:t>
+            </w:r>
+            <w:proofErr w:type="spellEnd"/>
+            <w:r>
+              <w:t>（</w:t>
+            </w:r>
+            <w:r>
+              <w:t xml:space="preserve">5 </w:t>
+            </w:r>
+            <w:r>
+              <w:t>程序）</w:t>
+            </w:r>
+          </w:p>
+        </w:tc>
+        <w:tc>
+          <w:tcPr>
+            <w:tcW w:w="0" w:type="auto"/>
+            <w:hideMark/>
+          </w:tcPr>
+          <w:p>
+            <w:pPr>
+              <w:jc w:val="right"/>
+            </w:pPr>
+          </w:p>
+        </w:tc>
+        <w:tc>
+          <w:tcPr>
+            <w:tcW w:w="0" w:type="auto"/>
+            <w:hideMark/>
+          </w:tcPr>
+          <w:p>
+            <w:pPr>
+              <w:jc w:val="right"/>
+            </w:pPr>
+          </w:p>
+        </w:tc>
+        <w:tc>
+          <w:tcPr>
+            <w:tcW w:w="0" w:type="auto"/>
+            <w:hideMark/>
+          </w:tcPr>
+          <w:p>
+            <w:pPr>
+              <w:jc w:val="right"/>
+            </w:pPr>
+            <w:r>
+              <w:rPr>
+                <w:rFonts w:hint="eastAsia"/>
+              </w:rPr>
+              <w:t>1</w:t>
+            </w:r>
+            <w:r>
+              <w:t>289</w:t>
+            </w:r>
+          </w:p>
+        </w:tc>
+        <w:tc>
+          <w:tcPr>
+            <w:tcW w:w="0" w:type="auto"/>
+            <w:hideMark/>
+          </w:tcPr>
+          <w:p>
+            <w:pPr>
+              <w:jc w:val="right"/>
+            </w:pPr>
+            <w:r>
+              <w:rPr>
+                <w:rFonts w:hint="eastAsia"/>
+              </w:rPr>
+              <w:t>1</w:t>
+            </w:r>
+            <w:r>
+              <w:t>102</w:t>
+            </w:r>
+          </w:p>
+        </w:tc>
+      </w:tr>
+      <w:tr>
+        <w:tc>
+          <w:tcPr>
+            <w:tcW w:w="0" w:type="auto"/>
+            <w:hideMark/>
+          </w:tcPr>
+          <w:p>
+            <w:pPr>
+              <w:jc w:val="left"/>
+            </w:pPr>
+            <w:proofErr w:type="spellStart"/>
+            <w:r>
+              <w:t>LLaMA</w:t>
+            </w:r>
+            <w:proofErr w:type="spellEnd"/>
+            <w:r>
+              <w:t>（</w:t>
+            </w:r>
+            <w:r>
+              <w:t xml:space="preserve">3 </w:t>
+            </w:r>
+            <w:r>
+              <w:t>程序）</w:t>
+            </w:r>
+          </w:p>
+        </w:tc>
+        <w:tc>
+          <w:tcPr>
+            <w:tcW w:w="0" w:type="auto"/>
+            <w:hideMark/>
+          </w:tcPr>
+          <w:p>
+            <w:pPr>
+              <w:jc w:val="right"/>
+            </w:pPr>
+          </w:p>
+        </w:tc>
+        <w:tc>
+          <w:tcPr>
+            <w:tcW w:w="0" w:type="auto"/>
+            <w:hideMark/>
+          </w:tcPr>
+          <w:p>
+            <w:pPr>
+              <w:jc w:val="right"/>
+            </w:pPr>
+          </w:p>
+        </w:tc>
+        <w:tc>
+          <w:tcPr>
+            <w:tcW w:w="0" w:type="auto"/>
+            <w:hideMark/>
+          </w:tcPr>
+          <w:p>
+            <w:pPr>
+              <w:jc w:val="right"/>
+            </w:pPr>
+            <w:r>
+              <w:rPr>
+                <w:rFonts w:hint="eastAsia"/>
+              </w:rPr>
+              <w:t>1</w:t>
+            </w:r>
+            <w:r>
+              <w:t>249</w:t>
+            </w:r>
+          </w:p>
+        </w:tc>
+        <w:tc>
+          <w:tcPr>
+            <w:tcW w:w="0" w:type="auto"/>
+            <w:hideMark/>
+          </w:tcPr>
+          <w:p>
+            <w:pPr>
+              <w:jc w:val="right"/>
+            </w:pPr>
+            <w:r>
+              <w:rPr>
+                <w:rFonts w:hint="eastAsia"/>
+              </w:rPr>
+              <w:t>1</w:t>
+            </w:r>
+            <w:r>
+              <w:t>075</w:t>
+            </w:r>
+          </w:p>
+        </w:tc>
+      </w:tr>
+    </w:tbl>
+    <w:p>
+      <w:pPr>
+        <w:pStyle w:val="a4"/>
+        <w:jc w:val="both"/>
+      </w:pPr>
     </w:p>
     <w:p>
       <w:pPr>
         <w:pStyle w:val="a4"/>
         <w:jc w:val="both"/>
       </w:pPr>
+      <w:r>
+        <w:t>codex resume 01a0a811-d180-79b3-8a9a-64a9be4d6c00</w:t>
+      </w:r>
+    </w:p>
+    <w:bookmarkEnd w:id="9"/>
+    <w:p>
+      <w:pPr>
+        <w:pStyle w:val="a4"/>
+        <w:jc w:val="both"/>
+      </w:pPr>
     </w:p>
     <w:p>
       <w:pPr>
@@ -14155,7 +15667,7 @@
           <w:rFonts w:ascii="Cambria" w:hAnsi="Cambria" w:cs="Cambria"/>
         </w:rPr>
       </w:pPr>
-      <w:bookmarkStart w:id="6" w:name="OLE_LINK3"/>
+      <w:bookmarkStart w:id="10" w:name="OLE_LINK3"/>
       <w:r>
         <w:rPr>
           <w:rFonts w:ascii="Cambria" w:hAnsi="Cambria" w:cs="Cambria" w:hint="eastAsia"/>
@@ -14180,7 +15692,7 @@
         </w:rPr>
         <w:t xml:space="preserve">&gt;=N.  </w:t>
       </w:r>
-      <w:bookmarkEnd w:id="6"/>
+      <w:bookmarkEnd w:id="10"/>
       <w:r>
         <w:rPr>
           <w:rFonts w:ascii="Cambria" w:hAnsi="Cambria" w:cs="Cambria"/>
@@ -14310,7 +15822,7 @@
           <w:rFonts w:ascii="Cambria" w:hAnsi="Cambria" w:cs="Cambria"/>
         </w:rPr>
       </w:pPr>
-      <w:bookmarkStart w:id="7" w:name="OLE_LINK4"/>
+      <w:bookmarkStart w:id="11" w:name="OLE_LINK4"/>
       <w:r>
         <w:rPr>
           <w:rFonts w:hint="eastAsia"/>
@@ -14397,7 +15909,7 @@
         </w:rPr>
         <w:t>有效槽（不会太影响性能）</w:t>
       </w:r>
-      <w:bookmarkEnd w:id="7"/>
+      <w:bookmarkEnd w:id="11"/>
       <w:r>
         <w:rPr>
           <w:rFonts w:ascii="Cambria" w:hAnsi="Cambria" w:cs="Cambria" w:hint="eastAsia"/>
@@ -15897,34 +17409,34 @@
       </w:pPr>
     </w:lvl>
   </w:abstractNum>
-  <w:num w:numId="1" w16cid:durableId="424230457">
+  <w:num w:numId="1" w16cid:durableId="1653948392">
     <w:abstractNumId w:val="1"/>
   </w:num>
-  <w:num w:numId="2" w16cid:durableId="2119988645">
+  <w:num w:numId="2" w16cid:durableId="1198198190">
     <w:abstractNumId w:val="6"/>
   </w:num>
-  <w:num w:numId="3" w16cid:durableId="1797989388">
+  <w:num w:numId="3" w16cid:durableId="1335180773">
     <w:abstractNumId w:val="7"/>
   </w:num>
-  <w:num w:numId="4" w16cid:durableId="2144036779">
+  <w:num w:numId="4" w16cid:durableId="1371223274">
     <w:abstractNumId w:val="9"/>
   </w:num>
-  <w:num w:numId="5" w16cid:durableId="727874050">
+  <w:num w:numId="5" w16cid:durableId="942150880">
     <w:abstractNumId w:val="8"/>
   </w:num>
-  <w:num w:numId="6" w16cid:durableId="1399591350">
+  <w:num w:numId="6" w16cid:durableId="612399310">
     <w:abstractNumId w:val="5"/>
   </w:num>
-  <w:num w:numId="7" w16cid:durableId="329220014">
+  <w:num w:numId="7" w16cid:durableId="1617445155">
     <w:abstractNumId w:val="0"/>
   </w:num>
-  <w:num w:numId="8" w16cid:durableId="2058814233">
+  <w:num w:numId="8" w16cid:durableId="1385447836">
     <w:abstractNumId w:val="4"/>
   </w:num>
-  <w:num w:numId="9" w16cid:durableId="637492576">
+  <w:num w:numId="9" w16cid:durableId="1824005644">
     <w:abstractNumId w:val="3"/>
   </w:num>
-  <w:num w:numId="10" w16cid:durableId="119812416">
+  <w:num w:numId="10" w16cid:durableId="603608538">
     <w:abstractNumId w:val="2"/>
   </w:num>
 </w:numbering>

</xml_diff>